<commit_message>
DAR report: document fiber-placement midpoint bug (quadrupole-only; dipole/sky-sub conclusion intact)
</commit_message>
<xml_diff>
--- a/docs/DAR_FIBER_LOSS_REPORT.docx
+++ b/docs/DAR_FIBER_LOSS_REPORT.docx
@@ -831,7 +831,7 @@
     </w:p>
     <w:bookmarkEnd w:id="9"/>
     <w:bookmarkEnd w:id="10"/>
-    <w:bookmarkStart w:id="11" w:name="X99603e5bcf91573208e8238ba6729b2dc9d70eb"/>
+    <w:bookmarkStart w:id="11" w:name="Xef68bf2c3ba5f94e24108397839269c31c2458d"/>
     <w:p>
       <w:pPr>
         <w:pStyle w:val="Heading1"/>
@@ -1099,7 +1099,7 @@
       </w:r>
     </w:p>
     <w:bookmarkEnd w:id="11"/>
-    <w:bookmarkStart w:id="23" w:name="X8565ec86bdb7ec1a7f363dfff025706e2f4f58b"/>
+    <w:bookmarkStart w:id="23" w:name="Xceb7f3bce8a7eff7b10157d202ac722ae3fb177"/>
     <w:p>
       <w:pPr>
         <w:pStyle w:val="Heading1"/>
@@ -1108,7 +1108,7 @@
         <w:t xml:space="preserve">Part II — The detection: the loss pattern and its structure</w:t>
       </w:r>
     </w:p>
-    <w:bookmarkStart w:id="15" w:name="X8de25ee2f566d54bd868ae494693b636aba8bd2"/>
+    <w:bookmarkStart w:id="15" w:name="Xe861a5fea7f06b33a77c0bd93532c56021c9fac"/>
     <w:p>
       <w:pPr>
         <w:pStyle w:val="Heading2"/>
@@ -1651,7 +1651,7 @@
       </w:r>
     </w:p>
     <w:bookmarkEnd w:id="15"/>
-    <w:bookmarkStart w:id="22" w:name="X1439326b319707bb54d1970abe12b6a0063b912"/>
+    <w:bookmarkStart w:id="22" w:name="Xbf7748f15e21f9be9112fd5a0f3b0d863290904"/>
     <w:p>
       <w:pPr>
         <w:pStyle w:val="Heading2"/>
@@ -2388,7 +2388,7 @@
     </w:p>
     <w:bookmarkEnd w:id="22"/>
     <w:bookmarkEnd w:id="23"/>
-    <w:bookmarkStart w:id="33" w:name="Xa68f3f2a63286b48c5824a152dd958f2787e663"/>
+    <w:bookmarkStart w:id="33" w:name="X071d75de13aa4e2ae88643635901cc973491f81"/>
     <w:p>
       <w:pPr>
         <w:pStyle w:val="Heading1"/>
@@ -2397,7 +2397,7 @@
         <w:t xml:space="preserve">Part III — The quadrupole is real DAR, and it sets the observing strategy</w:t>
       </w:r>
     </w:p>
-    <w:bookmarkStart w:id="27" w:name="Xb1a536d82f8027cb9f917b53d6b820d0827d8ab"/>
+    <w:bookmarkStart w:id="27" w:name="X6abf06547f60d79ecaa640a1a4fb3f135401623"/>
     <w:p>
       <w:pPr>
         <w:pStyle w:val="Heading2"/>
@@ -2720,7 +2720,7 @@
       </w:r>
     </w:p>
     <w:bookmarkEnd w:id="27"/>
-    <w:bookmarkStart w:id="32" w:name="X247258e3290371bcd8450d543a5761a899480fa"/>
+    <w:bookmarkStart w:id="32" w:name="X1c78b0e9bcef3d7fff8fd8c4b29d68453092faa"/>
     <w:p>
       <w:pPr>
         <w:pStyle w:val="Heading2"/>
@@ -3004,7 +3004,8 @@
     <w:tbl>
       <w:tblPr>
         <w:tblStyle w:val="Table"/>
-        <w:tblW w:type="auto" w:w="0"/>
+        <w:tblW w:type="pct" w:w="5000"/>
+        <w:tblLayout w:type="fixed"/>
         <w:tblLook w:firstRow="1" w:lastRow="0" w:firstColumn="0" w:lastColumn="0" w:noHBand="0" w:noVBand="0" w:val="0020"/>
       </w:tblPr>
       <w:tblGrid>
@@ -3139,6 +3140,16 @@
             <w:r>
               <w:t xml:space="preserve">~0.1 μm</w:t>
             </w:r>
+            <w:r>
+              <w:t xml:space="preserve"> </w:t>
+            </w:r>
+            <w:r>
+              <w:rPr>
+                <w:i/>
+                <w:iCs/>
+              </w:rPr>
+              <w:t xml:space="preserve">(only if the fiber is placed at the midpoint — see Update 2026-08-10; it currently is not)</w:t>
+            </w:r>
           </w:p>
         </w:tc>
       </w:tr>
@@ -3309,41 +3320,100 @@
           <w:b/>
           <w:bCs/>
         </w:rPr>
-        <w:t xml:space="preserve">Positioning is not the lever</w:t>
-      </w:r>
-      <w:r>
-        <w:t xml:space="preserve"> </w:t>
-      </w:r>
-      <w:r>
-        <w:t xml:space="preserve">— the exposure midpoint already coincides with the integrated-loss optimum</w:t>
-      </w:r>
-      <w:r>
-        <w:t xml:space="preserve"> </w:t>
-      </w:r>
-      <w:r>
-        <w:t xml:space="preserve">to ~0.1 μm; and the effect is</w:t>
-      </w:r>
-      <w:r>
-        <w:t xml:space="preserve"> </w:t>
-      </w:r>
-      <w:r>
-        <w:rPr>
-          <w:b/>
-          <w:bCs/>
-        </w:rPr>
-        <w:t xml:space="preserve">invisible to short (3-min) dither sequences</w:t>
-      </w:r>
-      <w:r>
-        <w:t xml:space="preserve"> </w:t>
-      </w:r>
-      <w:r>
-        <w:t xml:space="preserve">used to validate positioning,</w:t>
-      </w:r>
-      <w:r>
-        <w:t xml:space="preserve"> </w:t>
-      </w:r>
-      <w:r>
-        <w:t xml:space="preserve">which accumulate essentially no rotation drift by construction.</w:t>
+        <w:t xml:space="preserve">Positioning — the midpoint is optimal, but the pipeline is not placing there</w:t>
+      </w:r>
+      <w:r>
+        <w:t xml:space="preserve"> </w:t>
+      </w:r>
+      <w:r>
+        <w:rPr>
+          <w:i/>
+          <w:iCs/>
+        </w:rPr>
+        <w:t xml:space="preserve">(updated 2026-08-10)</w:t>
+      </w:r>
+      <w:r>
+        <w:t xml:space="preserve">. The</w:t>
+      </w:r>
+      <w:r>
+        <w:t xml:space="preserve"> </w:t>
+      </w:r>
+      <w:r>
+        <w:t xml:space="preserve">exposure midpoint coincides with the integrated-loss optimum to ~0.1 μm</w:t>
+      </w:r>
+      <w:r>
+        <w:t xml:space="preserve"> </w:t>
+      </w:r>
+      <w:r>
+        <w:rPr>
+          <w:i/>
+          <w:iCs/>
+        </w:rPr>
+        <w:t xml:space="preserve">if the fiber is placed there</w:t>
+      </w:r>
+      <w:r>
+        <w:t xml:space="preserve"> </w:t>
+      </w:r>
+      <w:r>
+        <w:t xml:space="preserve">— but a</w:t>
+      </w:r>
+      <w:r>
+        <w:t xml:space="preserve"> </w:t>
+      </w:r>
+      <w:r>
+        <w:t xml:space="preserve">fiber-placement timing bug currently puts it at ~the exposure</w:t>
+      </w:r>
+      <w:r>
+        <w:t xml:space="preserve"> </w:t>
+      </w:r>
+      <w:r>
+        <w:rPr>
+          <w:b/>
+          <w:bCs/>
+        </w:rPr>
+        <w:t xml:space="preserve">quarter-point</w:t>
+      </w:r>
+      <w:r>
+        <w:t xml:space="preserve"> </w:t>
+      </w:r>
+      <w:r>
+        <w:t xml:space="preserve">(see the Update below), so</w:t>
+      </w:r>
+      <w:r>
+        <w:t xml:space="preserve"> </w:t>
+      </w:r>
+      <w:r>
+        <w:t xml:space="preserve">positioning is in fact a real, recoverable lever. The effect remains</w:t>
+      </w:r>
+      <w:r>
+        <w:t xml:space="preserve"> </w:t>
+      </w:r>
+      <w:r>
+        <w:rPr>
+          <w:b/>
+          <w:bCs/>
+        </w:rPr>
+        <w:t xml:space="preserve">invisible to short (3-min) dither</w:t>
+      </w:r>
+      <w:r>
+        <w:rPr>
+          <w:b/>
+          <w:bCs/>
+        </w:rPr>
+        <w:t xml:space="preserve"> </w:t>
+      </w:r>
+      <w:r>
+        <w:rPr>
+          <w:b/>
+          <w:bCs/>
+        </w:rPr>
+        <w:t xml:space="preserve">sequences</w:t>
+      </w:r>
+      <w:r>
+        <w:t xml:space="preserve"> </w:t>
+      </w:r>
+      <w:r>
+        <w:t xml:space="preserve">used to validate positioning, which accumulate essentially no rotation drift by construction.</w:t>
       </w:r>
     </w:p>
     <w:p>
@@ -3451,7 +3521,690 @@
         <w:t xml:space="preserve">far-southern science sample exists yet to measure it — flagged, not quantified.</w:t>
       </w:r>
     </w:p>
-    <w:bookmarkStart w:id="31" w:name="Xcbb8a9f66fddba7e0400480c94e28aa41523a33"/>
+    <w:p>
+      <w:pPr>
+        <w:pStyle w:val="BlockText"/>
+      </w:pPr>
+      <w:r>
+        <w:rPr>
+          <w:b/>
+          <w:bCs/>
+        </w:rPr>
+        <w:t xml:space="preserve">Update (2026-08-10) — fiber-placement midpoint bug (found in a follow-up code review).</w:t>
+      </w:r>
+      <w:r>
+        <w:t xml:space="preserve"> </w:t>
+      </w:r>
+      <w:r>
+        <w:t xml:space="preserve">The</w:t>
+      </w:r>
+      <w:r>
+        <w:t xml:space="preserve"> </w:t>
+      </w:r>
+      <w:r>
+        <w:t xml:space="preserve">“positioning is not a lever”</w:t>
+      </w:r>
+      <w:r>
+        <w:t xml:space="preserve"> </w:t>
+      </w:r>
+      <w:r>
+        <w:t xml:space="preserve">reading above is</w:t>
+      </w:r>
+      <w:r>
+        <w:t xml:space="preserve"> </w:t>
+      </w:r>
+      <w:r>
+        <w:rPr>
+          <w:b/>
+          <w:bCs/>
+        </w:rPr>
+        <w:t xml:space="preserve">superseded</w:t>
+      </w:r>
+      <w:r>
+        <w:t xml:space="preserve">. The optimizer’s fiber-placement midtime should</w:t>
+      </w:r>
+      <w:r>
+        <w:t xml:space="preserve"> </w:t>
+      </w:r>
+      <w:r>
+        <w:t xml:space="preserve">be</w:t>
+      </w:r>
+      <w:r>
+        <w:t xml:space="preserve"> </w:t>
+      </w:r>
+      <w:r>
+        <w:rPr>
+          <w:rStyle w:val="VerbatimChar"/>
+        </w:rPr>
+        <w:t xml:space="preserve">min(esttime, 1800 s)/2</w:t>
+      </w:r>
+      <w:r>
+        <w:t xml:space="preserve"> </w:t>
+      </w:r>
+      <w:r>
+        <w:t xml:space="preserve">— the flux-weighted midpoint of the (possibly split) exposure, where</w:t>
+      </w:r>
+      <w:r>
+        <w:t xml:space="preserve"> </w:t>
+      </w:r>
+      <w:r>
+        <w:rPr>
+          <w:rStyle w:val="VerbatimChar"/>
+        </w:rPr>
+        <w:t xml:space="preserve">esttime</w:t>
+      </w:r>
+      <w:r>
+        <w:t xml:space="preserve"> </w:t>
+      </w:r>
+      <w:r>
+        <w:t xml:space="preserve">is</w:t>
+      </w:r>
+      <w:r>
+        <w:t xml:space="preserve"> </w:t>
+      </w:r>
+      <w:r>
+        <w:t xml:space="preserve">the dynamic scheduler’s conditions-aware duration estimate (≈</w:t>
+      </w:r>
+      <w:r>
+        <w:t xml:space="preserve"> </w:t>
+      </w:r>
+      <w:r>
+        <w:rPr>
+          <w:rStyle w:val="VerbatimChar"/>
+        </w:rPr>
+        <w:t xml:space="preserve">exptime</w:t>
+      </w:r>
+      <w:r>
+        <w:t xml:space="preserve">). A miscommunication applied a factor</w:t>
+      </w:r>
+      <w:r>
+        <w:t xml:space="preserve"> </w:t>
+      </w:r>
+      <w:r>
+        <w:t xml:space="preserve">of ½ on</w:t>
+      </w:r>
+      <w:r>
+        <w:t xml:space="preserve"> </w:t>
+      </w:r>
+      <w:r>
+        <w:rPr>
+          <w:b/>
+          <w:bCs/>
+        </w:rPr>
+        <w:t xml:space="preserve">both</w:t>
+      </w:r>
+      <w:r>
+        <w:t xml:space="preserve"> </w:t>
+      </w:r>
+      <w:r>
+        <w:t xml:space="preserve">the control side and inside PlateMaker, so the robots are optimized for</w:t>
+      </w:r>
+      <w:r>
+        <w:t xml:space="preserve"> </w:t>
+      </w:r>
+      <w:r>
+        <w:rPr>
+          <w:rStyle w:val="VerbatimChar"/>
+        </w:rPr>
+        <w:t xml:space="preserve">min(esttime,1800)/4</w:t>
+      </w:r>
+      <w:r>
+        <w:t xml:space="preserve"> </w:t>
+      </w:r>
+      <w:r>
+        <w:t xml:space="preserve">— roughly the</w:t>
+      </w:r>
+      <w:r>
+        <w:t xml:space="preserve"> </w:t>
+      </w:r>
+      <w:r>
+        <w:rPr>
+          <w:b/>
+          <w:bCs/>
+        </w:rPr>
+        <w:t xml:space="preserve">exposure quarter-point, not the midpoint</w:t>
+      </w:r>
+      <w:r>
+        <w:t xml:space="preserve">. (A +120 s setup overhead is added</w:t>
+      </w:r>
+      <w:r>
+        <w:t xml:space="preserve"> </w:t>
+      </w:r>
+      <w:r>
+        <w:rPr>
+          <w:i/>
+          <w:iCs/>
+        </w:rPr>
+        <w:t xml:space="preserve">after</w:t>
+      </w:r>
+      <w:r>
+        <w:t xml:space="preserve"> </w:t>
+      </w:r>
+      <w:r>
+        <w:t xml:space="preserve">the ½</w:t>
+      </w:r>
+      <w:r>
+        <w:t xml:space="preserve"> </w:t>
+      </w:r>
+      <w:r>
+        <w:t xml:space="preserve">and is common-mode between the intended and buggy paths, so it does not offset the error.) Over the non-split</w:t>
+      </w:r>
+      <w:r>
+        <w:t xml:space="preserve"> </w:t>
+      </w:r>
+      <w:r>
+        <w:t xml:space="preserve">sample (</w:t>
+      </w:r>
+      <w:r>
+        <w:rPr>
+          <w:rStyle w:val="VerbatimChar"/>
+        </w:rPr>
+        <w:t xml:space="preserve">esttime ≤ 1800</w:t>
+      </w:r>
+      <w:r>
+        <w:t xml:space="preserve">, ~68% of exposures): the fiber is optimized for ~⅓ of the way through the exposure —</w:t>
+      </w:r>
+      <w:r>
+        <w:t xml:space="preserve"> </w:t>
+      </w:r>
+      <w:r>
+        <w:t xml:space="preserve">a</w:t>
+      </w:r>
+      <w:r>
+        <w:t xml:space="preserve"> </w:t>
+      </w:r>
+      <w:r>
+        <w:rPr>
+          <w:b/>
+          <w:bCs/>
+        </w:rPr>
+        <w:t xml:space="preserve">median ~184 s too early, with 93% of exposures placed too early</w:t>
+      </w:r>
+      <w:r>
+        <w:t xml:space="preserve">; correcting the double-½ moves it ~336 s</w:t>
+      </w:r>
+      <w:r>
+        <w:t xml:space="preserve"> </w:t>
+      </w:r>
+      <w:r>
+        <w:t xml:space="preserve">later, onto the true midpoint.</w:t>
+      </w:r>
+    </w:p>
+    <w:p>
+      <w:pPr>
+        <w:pStyle w:val="BlockText"/>
+      </w:pPr>
+      <w:r>
+        <w:t xml:space="preserve">Two consequences, kept separate:</w:t>
+      </w:r>
+    </w:p>
+    <w:p>
+      <w:pPr>
+        <w:pStyle w:val="BlockText"/>
+        <w:numPr>
+          <w:ilvl w:val="0"/>
+          <w:numId w:val="1005"/>
+        </w:numPr>
+      </w:pPr>
+      <w:r>
+        <w:rPr>
+          <w:b/>
+          <w:bCs/>
+        </w:rPr>
+        <w:t xml:space="preserve">The dipole / sky-subtraction result — this report’s headline — is unaffected.</w:t>
+      </w:r>
+      <w:r>
+        <w:t xml:space="preserve"> </w:t>
+      </w:r>
+      <w:r>
+        <w:t xml:space="preserve">A mis-timed placement is a</w:t>
+      </w:r>
+      <w:r>
+        <w:t xml:space="preserve"> </w:t>
+      </w:r>
+      <w:r>
+        <w:t xml:space="preserve">purely</w:t>
+      </w:r>
+      <w:r>
+        <w:t xml:space="preserve"> </w:t>
+      </w:r>
+      <w:r>
+        <w:rPr>
+          <w:i/>
+          <w:iCs/>
+        </w:rPr>
+        <w:t xml:space="preserve">geometric</w:t>
+      </w:r>
+      <w:r>
+        <w:t xml:space="preserve"> </w:t>
+      </w:r>
+      <w:r>
+        <w:t xml:space="preserve">effect, and the boresight translation a dipole would ride on is removed by the guider in</w:t>
+      </w:r>
+      <w:r>
+        <w:t xml:space="preserve"> </w:t>
+      </w:r>
+      <w:r>
+        <w:t xml:space="preserve">real time; what survives is a</w:t>
+      </w:r>
+      <w:r>
+        <w:t xml:space="preserve"> </w:t>
+      </w:r>
+      <w:r>
+        <w:rPr>
+          <w:i/>
+          <w:iCs/>
+        </w:rPr>
+        <w:t xml:space="preserve">field-differential</w:t>
+      </w:r>
+      <w:r>
+        <w:t xml:space="preserve"> </w:t>
+      </w:r>
+      <w:r>
+        <w:t xml:space="preserve">(scale+shear →</w:t>
+      </w:r>
+      <w:r>
+        <w:t xml:space="preserve"> </w:t>
+      </w:r>
+      <w:r>
+        <w:rPr>
+          <w:b/>
+          <w:bCs/>
+        </w:rPr>
+        <w:t xml:space="preserve">quadrupole</w:t>
+      </w:r>
+      <w:r>
+        <w:t xml:space="preserve">) residual. It adds to the</w:t>
+      </w:r>
+      <w:r>
+        <w:t xml:space="preserve"> </w:t>
+      </w:r>
+      <w:r>
+        <w:t xml:space="preserve">real</w:t>
+      </w:r>
+      <w:r>
+        <w:t xml:space="preserve"> </w:t>
+      </w:r>
+      <w:r>
+        <w:rPr>
+          <w:rStyle w:val="VerbatimChar"/>
+        </w:rPr>
+        <w:t xml:space="preserve">Q_rot</w:t>
+      </w:r>
+      <w:r>
+        <w:t xml:space="preserve"> </w:t>
+      </w:r>
+      <w:r>
+        <w:t xml:space="preserve">/</w:t>
+      </w:r>
+      <w:r>
+        <w:t xml:space="preserve"> </w:t>
+      </w:r>
+      <w:r>
+        <w:rPr>
+          <w:rStyle w:val="VerbatimChar"/>
+        </w:rPr>
+        <w:t xml:space="preserve">L_field</w:t>
+      </w:r>
+      <w:r>
+        <w:t xml:space="preserve"> </w:t>
+      </w:r>
+      <w:r>
+        <w:t xml:space="preserve">channel and</w:t>
+      </w:r>
+      <w:r>
+        <w:t xml:space="preserve"> </w:t>
+      </w:r>
+      <w:r>
+        <w:rPr>
+          <w:b/>
+          <w:bCs/>
+        </w:rPr>
+        <w:t xml:space="preserve">cannot</w:t>
+      </w:r>
+      <w:r>
+        <w:t xml:space="preserve"> </w:t>
+      </w:r>
+      <w:r>
+        <w:t xml:space="preserve">contribute to the rotating dipole</w:t>
+      </w:r>
+      <w:r>
+        <w:t xml:space="preserve"> </w:t>
+      </w:r>
+      <w:r>
+        <w:rPr>
+          <w:rStyle w:val="VerbatimChar"/>
+        </w:rPr>
+        <w:t xml:space="preserve">D_rot</w:t>
+      </w:r>
+      <w:r>
+        <w:t xml:space="preserve"> </w:t>
+      </w:r>
+      <w:r>
+        <w:t xml:space="preserve">(the two are</w:t>
+      </w:r>
+      <w:r>
+        <w:t xml:space="preserve"> </w:t>
+      </w:r>
+      <w:r>
+        <w:t xml:space="preserve">orthogonal in the fit).</w:t>
+      </w:r>
+      <w:r>
+        <w:t xml:space="preserve"> </w:t>
+      </w:r>
+      <w:r>
+        <w:rPr>
+          <w:i/>
+          <w:iCs/>
+        </w:rPr>
+        <w:t xml:space="preserve">(A prior</w:t>
+      </w:r>
+      <w:r>
+        <w:rPr>
+          <w:i/>
+          <w:iCs/>
+        </w:rPr>
+        <w:t xml:space="preserve"> </w:t>
+      </w:r>
+      <w:r>
+        <w:rPr>
+          <w:rStyle w:val="VerbatimChar"/>
+          <w:i/>
+          <w:iCs/>
+        </w:rPr>
+        <w:t xml:space="preserve">reqtime</w:t>
+      </w:r>
+      <w:r>
+        <w:rPr>
+          <w:i/>
+          <w:iCs/>
+        </w:rPr>
+        <w:t xml:space="preserve">/</w:t>
+      </w:r>
+      <w:r>
+        <w:rPr>
+          <w:rStyle w:val="VerbatimChar"/>
+          <w:i/>
+          <w:iCs/>
+        </w:rPr>
+        <w:t xml:space="preserve">exptime</w:t>
+      </w:r>
+      <w:r>
+        <w:rPr>
+          <w:i/>
+          <w:iCs/>
+        </w:rPr>
+        <w:t xml:space="preserve"> </w:t>
+      </w:r>
+      <w:r>
+        <w:rPr>
+          <w:i/>
+          <w:iCs/>
+        </w:rPr>
+        <w:t xml:space="preserve">midpoint elimination in the superseded dipole handoff</w:t>
+      </w:r>
+      <w:r>
+        <w:rPr>
+          <w:i/>
+          <w:iCs/>
+        </w:rPr>
+        <w:t xml:space="preserve"> </w:t>
+      </w:r>
+      <w:r>
+        <w:rPr>
+          <w:i/>
+          <w:iCs/>
+        </w:rPr>
+        <w:t xml:space="preserve">regressed against</w:t>
+      </w:r>
+      <w:r>
+        <w:rPr>
+          <w:i/>
+          <w:iCs/>
+        </w:rPr>
+        <w:t xml:space="preserve"> </w:t>
+      </w:r>
+      <w:r>
+        <w:rPr>
+          <w:rStyle w:val="VerbatimChar"/>
+          <w:i/>
+          <w:iCs/>
+        </w:rPr>
+        <w:t xml:space="preserve">reqtime − exptime</w:t>
+      </w:r>
+      <w:r>
+        <w:rPr>
+          <w:i/>
+          <w:iCs/>
+        </w:rPr>
+        <w:t xml:space="preserve">, now known to be the wrong variable — but the dipole ruling never</w:t>
+      </w:r>
+      <w:r>
+        <w:rPr>
+          <w:i/>
+          <w:iCs/>
+        </w:rPr>
+        <w:t xml:space="preserve"> </w:t>
+      </w:r>
+      <w:r>
+        <w:rPr>
+          <w:i/>
+          <w:iCs/>
+        </w:rPr>
+        <w:t xml:space="preserve">rested on it; it rests on the dither geometry, which shows no rotating dipole.)</w:t>
+      </w:r>
+    </w:p>
+    <w:p>
+      <w:pPr>
+        <w:pStyle w:val="BlockText"/>
+        <w:numPr>
+          <w:ilvl w:val="0"/>
+          <w:numId w:val="1005"/>
+        </w:numPr>
+      </w:pPr>
+      <w:r>
+        <w:rPr>
+          <w:b/>
+          <w:bCs/>
+        </w:rPr>
+        <w:t xml:space="preserve">Only the ~0.1 μm</w:t>
+      </w:r>
+      <w:r>
+        <w:rPr>
+          <w:b/>
+          <w:bCs/>
+        </w:rPr>
+        <w:t xml:space="preserve"> </w:t>
+      </w:r>
+      <w:r>
+        <w:rPr>
+          <w:b/>
+          <w:bCs/>
+        </w:rPr>
+        <w:t xml:space="preserve">“midpoint-optimal”</w:t>
+      </w:r>
+      <w:r>
+        <w:rPr>
+          <w:b/>
+          <w:bCs/>
+        </w:rPr>
+        <w:t xml:space="preserve"> </w:t>
+      </w:r>
+      <w:r>
+        <w:rPr>
+          <w:b/>
+          <w:bCs/>
+        </w:rPr>
+        <w:t xml:space="preserve">figure changes.</w:t>
+      </w:r>
+      <w:r>
+        <w:t xml:space="preserve"> </w:t>
+      </w:r>
+      <w:r>
+        <w:t xml:space="preserve">At the midpoint the positioning residual is</w:t>
+      </w:r>
+      <w:r>
+        <w:t xml:space="preserve"> </w:t>
+      </w:r>
+      <w:r>
+        <w:t xml:space="preserve">second-order (~0.1 μm); at the quarter-point it is first-order. An order-of-magnitude estimate from the</w:t>
+      </w:r>
+      <w:r>
+        <w:t xml:space="preserve"> </w:t>
+      </w:r>
+      <w:r>
+        <w:t xml:space="preserve">worked example above is a</w:t>
+      </w:r>
+      <w:r>
+        <w:t xml:space="preserve"> </w:t>
+      </w:r>
+      <w:r>
+        <w:rPr>
+          <w:b/>
+          <w:bCs/>
+        </w:rPr>
+        <w:t xml:space="preserve">few μm / sub-1 % loss</w:t>
+      </w:r>
+      <w:r>
+        <w:t xml:space="preserve"> </w:t>
+      </w:r>
+      <w:r>
+        <w:t xml:space="preserve">— a real, systematic, and</w:t>
+      </w:r>
+      <w:r>
+        <w:t xml:space="preserve"> </w:t>
+      </w:r>
+      <w:r>
+        <w:rPr>
+          <w:b/>
+          <w:bCs/>
+        </w:rPr>
+        <w:t xml:space="preserve">fixable</w:t>
+      </w:r>
+      <w:r>
+        <w:t xml:space="preserve"> </w:t>
+      </w:r>
+      <w:r>
+        <w:t xml:space="preserve">placement penalty</w:t>
+      </w:r>
+      <w:r>
+        <w:t xml:space="preserve"> </w:t>
+      </w:r>
+      <w:r>
+        <w:t xml:space="preserve">already baked into every measured exposure. The exact per-exposure penalty (the proper successor to the</w:t>
+      </w:r>
+      <w:r>
+        <w:t xml:space="preserve"> </w:t>
+      </w:r>
+      <w:r>
+        <w:t xml:space="preserve">0.1 μm) is deferred to a post-shutdown recomputation of the field-differential integral with the reference</w:t>
+      </w:r>
+      <w:r>
+        <w:t xml:space="preserve"> </w:t>
+      </w:r>
+      <w:r>
+        <w:t xml:space="preserve">time set to</w:t>
+      </w:r>
+      <w:r>
+        <w:t xml:space="preserve"> </w:t>
+      </w:r>
+      <w:r>
+        <w:rPr>
+          <w:rStyle w:val="VerbatimChar"/>
+        </w:rPr>
+        <w:t xml:space="preserve">esttime/4</w:t>
+      </w:r>
+      <w:r>
+        <w:t xml:space="preserve">, restricted to</w:t>
+      </w:r>
+      <w:r>
+        <w:t xml:space="preserve"> </w:t>
+      </w:r>
+      <w:r>
+        <w:rPr>
+          <w:rStyle w:val="VerbatimChar"/>
+        </w:rPr>
+        <w:t xml:space="preserve">esttime ≤ 1800</w:t>
+      </w:r>
+      <w:r>
+        <w:t xml:space="preserve">.</w:t>
+      </w:r>
+    </w:p>
+    <w:p>
+      <w:pPr>
+        <w:pStyle w:val="BlockText"/>
+      </w:pPr>
+      <w:r>
+        <w:rPr>
+          <w:b/>
+          <w:bCs/>
+        </w:rPr>
+        <w:t xml:space="preserve">Status:</w:t>
+      </w:r>
+      <w:r>
+        <w:t xml:space="preserve"> </w:t>
+      </w:r>
+      <w:r>
+        <w:t xml:space="preserve">bug confirmed; fix planned after the 2026 summer shutdown. Splits are excluded above because their</w:t>
+      </w:r>
+      <w:r>
+        <w:t xml:space="preserve"> </w:t>
+      </w:r>
+      <w:r>
+        <w:rPr>
+          <w:rStyle w:val="VerbatimChar"/>
+        </w:rPr>
+        <w:t xml:space="preserve">esttime</w:t>
+      </w:r>
+      <w:r>
+        <w:t xml:space="preserve"> </w:t>
+      </w:r>
+      <w:r>
+        <w:t xml:space="preserve">is a</w:t>
+      </w:r>
+      <w:r>
+        <w:t xml:space="preserve"> </w:t>
+      </w:r>
+      <w:r>
+        <w:rPr>
+          <w:i/>
+          <w:iCs/>
+        </w:rPr>
+        <w:t xml:space="preserve">tile-level</w:t>
+      </w:r>
+      <w:r>
+        <w:t xml:space="preserve"> </w:t>
+      </w:r>
+      <w:r>
+        <w:t xml:space="preserve">estimate and the placement math is only clean for single integrations — note that</w:t>
+      </w:r>
+      <w:r>
+        <w:t xml:space="preserve"> </w:t>
+      </w:r>
+      <w:r>
+        <w:t xml:space="preserve">splits are disproportionately the high-airmass / long exposures where this penalty is</w:t>
+      </w:r>
+      <w:r>
+        <w:t xml:space="preserve"> </w:t>
+      </w:r>
+      <w:r>
+        <w:rPr>
+          <w:i/>
+          <w:iCs/>
+        </w:rPr>
+        <w:t xml:space="preserve">largest</w:t>
+      </w:r>
+      <w:r>
+        <w:t xml:space="preserve">, so the</w:t>
+      </w:r>
+      <w:r>
+        <w:t xml:space="preserve"> </w:t>
+      </w:r>
+      <w:r>
+        <w:t xml:space="preserve">non-split numbers characterize the mechanism but under-represent the worst case.</w:t>
+      </w:r>
+    </w:p>
+    <w:bookmarkStart w:id="31" w:name="X2684bdd679e4d862a7a60c7a3fa9c28ff770acd"/>
     <w:p>
       <w:pPr>
         <w:pStyle w:val="Heading3"/>
@@ -3815,7 +4568,7 @@
     <w:bookmarkEnd w:id="31"/>
     <w:bookmarkEnd w:id="32"/>
     <w:bookmarkEnd w:id="33"/>
-    <w:bookmarkStart w:id="50" w:name="Xdff2fbebea50b3df96e036368d20ba49c5440d3"/>
+    <w:bookmarkStart w:id="50" w:name="Xa3e9c7be84d7161e5d40fa217a60432723c5843"/>
     <w:p>
       <w:pPr>
         <w:pStyle w:val="Heading1"/>
@@ -3875,7 +4628,7 @@
         <w:t xml:space="preserve">between the fibers and the star field at all?</w:t>
       </w:r>
     </w:p>
-    <w:bookmarkStart w:id="37" w:name="X54abbf44ab4a509811c84968ebe0d7bb9c8601d"/>
+    <w:bookmarkStart w:id="37" w:name="X6bf40db4c0655552c40a7491c47f8c808f96279"/>
     <w:p>
       <w:pPr>
         <w:pStyle w:val="Heading2"/>
@@ -4168,7 +4921,7 @@
       </w:r>
     </w:p>
     <w:bookmarkEnd w:id="37"/>
-    <w:bookmarkStart w:id="38" w:name="Xc7229f07244332bd3793d76683d5cffef03bd4a"/>
+    <w:bookmarkStart w:id="38" w:name="X336cfcb644484bd925e2a7cb54998f8765d9040"/>
     <w:p>
       <w:pPr>
         <w:pStyle w:val="Heading2"/>
@@ -4205,7 +4958,7 @@
         <w:pStyle w:val="Compact"/>
         <w:numPr>
           <w:ilvl w:val="0"/>
-          <w:numId w:val="1005"/>
+          <w:numId w:val="1006"/>
         </w:numPr>
       </w:pPr>
       <w:r>
@@ -4255,7 +5008,7 @@
         <w:pStyle w:val="Compact"/>
         <w:numPr>
           <w:ilvl w:val="0"/>
-          <w:numId w:val="1005"/>
+          <w:numId w:val="1006"/>
         </w:numPr>
       </w:pPr>
       <w:r>
@@ -4330,7 +5083,7 @@
       </w:r>
     </w:p>
     <w:bookmarkEnd w:id="38"/>
-    <w:bookmarkStart w:id="42" w:name="localized-to-sky-subtraction"/>
+    <w:bookmarkStart w:id="42" w:name="Xed0165194d705d6922b4ac26961cd3aa402c559"/>
     <w:p>
       <w:pPr>
         <w:pStyle w:val="Heading2"/>
@@ -4458,7 +5211,7 @@
       </w:r>
     </w:p>
     <w:bookmarkEnd w:id="42"/>
-    <w:bookmarkStart w:id="49" w:name="what-kind-of-mechanism-discriminators"/>
+    <w:bookmarkStart w:id="49" w:name="X2bac0c651356c93e13b671ab8baba404d7e2faf"/>
     <w:p>
       <w:pPr>
         <w:pStyle w:val="Heading2"/>
@@ -4622,7 +5375,7 @@
         <w:pStyle w:val="Compact"/>
         <w:numPr>
           <w:ilvl w:val="0"/>
-          <w:numId w:val="1006"/>
+          <w:numId w:val="1007"/>
         </w:numPr>
       </w:pPr>
       <w:r>
@@ -4669,7 +5422,7 @@
         <w:pStyle w:val="Compact"/>
         <w:numPr>
           <w:ilvl w:val="0"/>
-          <w:numId w:val="1006"/>
+          <w:numId w:val="1007"/>
         </w:numPr>
       </w:pPr>
       <w:r>
@@ -4706,7 +5459,7 @@
         <w:pStyle w:val="Compact"/>
         <w:numPr>
           <w:ilvl w:val="0"/>
-          <w:numId w:val="1006"/>
+          <w:numId w:val="1007"/>
         </w:numPr>
       </w:pPr>
       <w:r>
@@ -4924,7 +5677,7 @@
     </w:p>
     <w:bookmarkEnd w:id="49"/>
     <w:bookmarkEnd w:id="50"/>
-    <w:bookmarkStart w:id="56" w:name="X246808b4d55eccee6d6922c121f16cc81c17427"/>
+    <w:bookmarkStart w:id="56" w:name="Xf2f7752bde81518e4a3ffe48162af3743db1b50"/>
     <w:p>
       <w:pPr>
         <w:pStyle w:val="Heading1"/>
@@ -5537,7 +6290,7 @@
         <w:pStyle w:val="Compact"/>
         <w:numPr>
           <w:ilvl w:val="0"/>
-          <w:numId w:val="1007"/>
+          <w:numId w:val="1008"/>
         </w:numPr>
       </w:pPr>
       <w:r>
@@ -5609,7 +6362,7 @@
         <w:pStyle w:val="Compact"/>
         <w:numPr>
           <w:ilvl w:val="0"/>
-          <w:numId w:val="1007"/>
+          <w:numId w:val="1008"/>
         </w:numPr>
       </w:pPr>
       <w:r>
@@ -5633,7 +6386,7 @@
       </w:r>
     </w:p>
     <w:bookmarkEnd w:id="54"/>
-    <w:bookmarkStart w:id="55" w:name="Xddc7554054b395957dd5292b8a4da5cafd3f92d"/>
+    <w:bookmarkStart w:id="55" w:name="X399a053f3d004d5b149216f16036a7bc6233a39"/>
     <w:p>
       <w:pPr>
         <w:pStyle w:val="Heading2"/>
@@ -6422,7 +7175,7 @@
     </w:p>
     <w:bookmarkEnd w:id="55"/>
     <w:bookmarkEnd w:id="56"/>
-    <w:bookmarkStart w:id="63" w:name="Xc7effeeef411b12f49a0a2475a8bea88646ced7"/>
+    <w:bookmarkStart w:id="63" w:name="Xb0361724a55936725eda80b20bb6d2b3235b692"/>
     <w:p>
       <w:pPr>
         <w:pStyle w:val="Heading1"/>
@@ -6438,196 +7191,6 @@
       </w:pPr>
       <w:r>
         <w:t xml:space="preserve">What we found</w:t>
-      </w:r>
-    </w:p>
-    <w:p>
-      <w:pPr>
-        <w:pStyle w:val="Compact"/>
-        <w:numPr>
-          <w:ilvl w:val="0"/>
-          <w:numId w:val="1008"/>
-        </w:numPr>
-      </w:pPr>
-      <w:r>
-        <w:rPr>
-          <w:b/>
-          <w:bCs/>
-        </w:rPr>
-        <w:t xml:space="preserve">The quadrupole is real DAR</w:t>
-      </w:r>
-      <w:r>
-        <w:t xml:space="preserve"> </w:t>
-      </w:r>
-      <w:r>
-        <w:t xml:space="preserve">(foundation-checked; matches Weiner, Kirkby, guide-star residuals, and the</w:t>
-      </w:r>
-      <w:r>
-        <w:t xml:space="preserve"> </w:t>
-      </w:r>
-      <w:r>
-        <w:t xml:space="preserve">dither offset field), and it gives a concrete observing lever:</w:t>
-      </w:r>
-      <w:r>
-        <w:t xml:space="preserve"> </w:t>
-      </w:r>
-      <w:r>
-        <w:rPr>
-          <w:b/>
-          <w:bCs/>
-        </w:rPr>
-        <w:t xml:space="preserve">proximity to transit</w:t>
-      </w:r>
-      <w:r>
-        <w:t xml:space="preserve">, plus capping</w:t>
-      </w:r>
-      <w:r>
-        <w:t xml:space="preserve"> </w:t>
-      </w:r>
-      <w:r>
-        <w:t xml:space="preserve">high-airmass exposure duration. This part of the study stands.</w:t>
-      </w:r>
-    </w:p>
-    <w:p>
-      <w:pPr>
-        <w:pStyle w:val="Compact"/>
-        <w:numPr>
-          <w:ilvl w:val="0"/>
-          <w:numId w:val="1008"/>
-        </w:numPr>
-      </w:pPr>
-      <w:r>
-        <w:rPr>
-          <w:b/>
-          <w:bCs/>
-        </w:rPr>
-        <w:t xml:space="preserve">The loss dipole is not DAR.</w:t>
-      </w:r>
-      <w:r>
-        <w:t xml:space="preserve"> </w:t>
-      </w:r>
-      <w:r>
-        <w:t xml:space="preserve">It is not a geometric fiber-to-light offset (dither), not in the stellar</w:t>
-      </w:r>
-      <w:r>
-        <w:t xml:space="preserve"> </w:t>
-      </w:r>
-      <w:r>
-        <w:t xml:space="preserve">model (model-vs-data split), and it reproduces on all point sources with external photometry — so it is a</w:t>
-      </w:r>
-      <w:r>
-        <w:t xml:space="preserve"> </w:t>
-      </w:r>
-      <w:r>
-        <w:rPr>
-          <w:b/>
-          <w:bCs/>
-        </w:rPr>
-        <w:t xml:space="preserve">flux-processing effect in point-source spectrophotometry</w:t>
-      </w:r>
-      <w:r>
-        <w:t xml:space="preserve">, entering at the</w:t>
-      </w:r>
-      <w:r>
-        <w:t xml:space="preserve"> </w:t>
-      </w:r>
-      <w:r>
-        <w:rPr>
-          <w:b/>
-          <w:bCs/>
-        </w:rPr>
-        <w:t xml:space="preserve">sky-subtraction</w:t>
-      </w:r>
-      <w:r>
-        <w:t xml:space="preserve"> </w:t>
-      </w:r>
-      <w:r>
-        <w:t xml:space="preserve">step of</w:t>
-      </w:r>
-      <w:r>
-        <w:t xml:space="preserve"> </w:t>
-      </w:r>
-      <w:r>
-        <w:t xml:space="preserve">the pipeline. It mimicked DAR because the night sky it couples to is zenith-tied and airmass-growing.</w:t>
-      </w:r>
-    </w:p>
-    <w:p>
-      <w:pPr>
-        <w:pStyle w:val="Compact"/>
-        <w:numPr>
-          <w:ilvl w:val="0"/>
-          <w:numId w:val="1008"/>
-        </w:numPr>
-      </w:pPr>
-      <w:r>
-        <w:rPr>
-          <w:rStyle w:val="VerbatimChar"/>
-          <w:b/>
-          <w:bCs/>
-        </w:rPr>
-        <w:t xml:space="preserve">RCALIBFRAC</w:t>
-      </w:r>
-      <w:r>
-        <w:rPr>
-          <w:b/>
-          <w:bCs/>
-        </w:rPr>
-        <w:t xml:space="preserve"> </w:t>
-      </w:r>
-      <w:r>
-        <w:rPr>
-          <w:b/>
-          <w:bCs/>
-        </w:rPr>
-        <w:t xml:space="preserve">carries two construction artifacts</w:t>
-      </w:r>
-      <w:r>
-        <w:t xml:space="preserve">, discovered here: the mid-2025 flat→psf aperture</w:t>
-      </w:r>
-      <w:r>
-        <w:t xml:space="preserve"> </w:t>
-      </w:r>
-      <w:r>
-        <w:t xml:space="preserve">correction that shifted the loss</w:t>
-      </w:r>
-      <w:r>
-        <w:t xml:space="preserve"> </w:t>
-      </w:r>
-      <w:r>
-        <w:rPr>
-          <w:i/>
-          <w:iCs/>
-        </w:rPr>
-        <w:t xml:space="preserve">level</w:t>
-      </w:r>
-      <w:r>
-        <w:t xml:space="preserve"> </w:t>
-      </w:r>
-      <w:r>
-        <w:t xml:space="preserve">(Finding 1), and the sky-subtraction dipole. It is not a clean</w:t>
-      </w:r>
-      <w:r>
-        <w:t xml:space="preserve"> </w:t>
-      </w:r>
-      <w:r>
-        <w:t xml:space="preserve">flux-loss estimator for a DAR study — but the physical DAR result (the quadrupole) is unaffected.</w:t>
-      </w:r>
-    </w:p>
-    <w:bookmarkEnd w:id="57"/>
-    <w:bookmarkStart w:id="58" w:name="Xc1d34e3e223548b959dc0d6546ba0848b4503aa"/>
-    <w:p>
-      <w:pPr>
-        <w:pStyle w:val="Heading2"/>
-      </w:pPr>
-      <w:r>
-        <w:t xml:space="preserve">Limitations — what a calibration reviewer would (rightly) push on</w:t>
-      </w:r>
-    </w:p>
-    <w:p>
-      <w:pPr>
-        <w:pStyle w:val="FirstParagraph"/>
-      </w:pPr>
-      <w:r>
-        <w:t xml:space="preserve">Stated explicitly rather than left for a reader to infer:</w:t>
       </w:r>
     </w:p>
     <w:p>
@@ -6643,130 +7206,38 @@
           <w:b/>
           <w:bCs/>
         </w:rPr>
-        <w:t xml:space="preserve">The step attribution rests on an external reimplementation.</w:t>
-      </w:r>
-      <w:r>
-        <w:t xml:space="preserve"> </w:t>
-      </w:r>
-      <w:r>
-        <w:t xml:space="preserve">Our stage-by-stage decomposition (§8),</w:t>
-      </w:r>
-      <w:r>
-        <w:t xml:space="preserve"> </w:t>
-      </w:r>
-      <w:r>
-        <w:t xml:space="preserve">which pins the jump to</w:t>
-      </w:r>
-      <w:r>
-        <w:t xml:space="preserve"> </w:t>
-      </w:r>
-      <w:r>
-        <w:rPr>
-          <w:rStyle w:val="VerbatimChar"/>
-        </w:rPr>
-        <w:t xml:space="preserve">subtract_sky</w:t>
-      </w:r>
-      <w:r>
-        <w:t xml:space="preserve"> </w:t>
-      </w:r>
-      <w:r>
-        <w:t xml:space="preserve">specifically, uses a reimplementation of the pipeline validated</w:t>
-      </w:r>
-      <w:r>
-        <w:t xml:space="preserve"> </w:t>
-      </w:r>
-      <w:r>
-        <w:t xml:space="preserve">against production only at the final</w:t>
-      </w:r>
-      <w:r>
-        <w:t xml:space="preserve"> </w:t>
-      </w:r>
-      <w:r>
-        <w:rPr>
-          <w:rStyle w:val="VerbatimChar"/>
-        </w:rPr>
-        <w:t xml:space="preserve">RCALIBFRAC</w:t>
-      </w:r>
-      <w:r>
-        <w:t xml:space="preserve"> </w:t>
-      </w:r>
-      <w:r>
-        <w:t xml:space="preserve">value, not at each intermediate stage (desispec does</w:t>
-      </w:r>
-      <w:r>
-        <w:t xml:space="preserve"> </w:t>
-      </w:r>
-      <w:r>
-        <w:t xml:space="preserve">not save those). A subtle reimplementation bug that moved the dipole between stages without changing the</w:t>
-      </w:r>
-      <w:r>
-        <w:t xml:space="preserve"> </w:t>
-      </w:r>
-      <w:r>
-        <w:t xml:space="preserve">final answer would not be caught by our checks.</w:t>
-      </w:r>
-      <w:r>
-        <w:t xml:space="preserve"> </w:t>
-      </w:r>
-      <w:r>
-        <w:t xml:space="preserve">“It is in the sky-subtracted flux”</w:t>
-      </w:r>
-      <w:r>
-        <w:t xml:space="preserve"> </w:t>
-      </w:r>
-      <w:r>
-        <w:t xml:space="preserve">is production-validated</w:t>
-      </w:r>
-      <w:r>
-        <w:t xml:space="preserve"> </w:t>
-      </w:r>
-      <w:r>
-        <w:t xml:space="preserve">(via the point-source metric on production flux, Part V);</w:t>
-      </w:r>
-      <w:r>
-        <w:t xml:space="preserve"> </w:t>
-      </w:r>
-      <w:r>
-        <w:t xml:space="preserve">“it enters at the</w:t>
-      </w:r>
-      <w:r>
-        <w:t xml:space="preserve"> </w:t>
-      </w:r>
-      <w:r>
-        <w:rPr>
-          <w:rStyle w:val="VerbatimChar"/>
-        </w:rPr>
-        <w:t xml:space="preserve">subtract_sky</w:t>
-      </w:r>
-      <w:r>
-        <w:t xml:space="preserve"> </w:t>
-      </w:r>
-      <w:r>
-        <w:t xml:space="preserve">step”</w:t>
-      </w:r>
-      <w:r>
-        <w:t xml:space="preserve"> </w:t>
-      </w:r>
-      <w:r>
-        <w:t xml:space="preserve">rather than an</w:t>
-      </w:r>
-      <w:r>
-        <w:t xml:space="preserve"> </w:t>
-      </w:r>
-      <w:r>
-        <w:t xml:space="preserve">adjacent step (e.g. extraction) is a strong lead for the pipeline authors to verify directly, not a</w:t>
-      </w:r>
-      <w:r>
-        <w:t xml:space="preserve"> </w:t>
-      </w:r>
-      <w:r>
-        <w:t xml:space="preserve">confirmed diagnosis. A small dipole already present in the raw extracted counts (§8) is a reminder the</w:t>
-      </w:r>
-      <w:r>
-        <w:t xml:space="preserve"> </w:t>
-      </w:r>
-      <w:r>
-        <w:t xml:space="preserve">step attribution is not clean-cut even in our own staging.</w:t>
+        <w:t xml:space="preserve">The quadrupole is real DAR</w:t>
+      </w:r>
+      <w:r>
+        <w:t xml:space="preserve"> </w:t>
+      </w:r>
+      <w:r>
+        <w:t xml:space="preserve">(foundation-checked; matches Weiner, Kirkby, guide-star residuals, and the</w:t>
+      </w:r>
+      <w:r>
+        <w:t xml:space="preserve"> </w:t>
+      </w:r>
+      <w:r>
+        <w:t xml:space="preserve">dither offset field), and it gives a concrete observing lever:</w:t>
+      </w:r>
+      <w:r>
+        <w:t xml:space="preserve"> </w:t>
+      </w:r>
+      <w:r>
+        <w:rPr>
+          <w:b/>
+          <w:bCs/>
+        </w:rPr>
+        <w:t xml:space="preserve">proximity to transit</w:t>
+      </w:r>
+      <w:r>
+        <w:t xml:space="preserve">, plus capping</w:t>
+      </w:r>
+      <w:r>
+        <w:t xml:space="preserve"> </w:t>
+      </w:r>
+      <w:r>
+        <w:t xml:space="preserve">high-airmass exposure duration. This part of the study stands.</w:t>
       </w:r>
     </w:p>
     <w:p>
@@ -6782,40 +7253,54 @@
           <w:b/>
           <w:bCs/>
         </w:rPr>
-        <w:t xml:space="preserve">Elimination is not identification.</w:t>
-      </w:r>
-      <w:r>
-        <w:t xml:space="preserve"> </w:t>
-      </w:r>
-      <w:r>
-        <w:t xml:space="preserve">We ruled out three specific</w:t>
-      </w:r>
-      <w:r>
-        <w:t xml:space="preserve"> </w:t>
-      </w:r>
-      <w:r>
-        <w:rPr>
-          <w:rStyle w:val="VerbatimChar"/>
-        </w:rPr>
-        <w:t xml:space="preserve">subtract_sky</w:t>
-      </w:r>
-      <w:r>
-        <w:t xml:space="preserve"> </w:t>
-      </w:r>
-      <w:r>
-        <w:t xml:space="preserve">mechanisms and the entire</w:t>
-      </w:r>
-      <w:r>
-        <w:t xml:space="preserve"> </w:t>
-      </w:r>
-      <w:r>
-        <w:t xml:space="preserve">ivar-weighting class; that narrows the search but does not prove any particular cause. The true mechanism</w:t>
-      </w:r>
-      <w:r>
-        <w:t xml:space="preserve"> </w:t>
-      </w:r>
-      <w:r>
-        <w:t xml:space="preserve">could be one we did not think to test, or in an adjacent step.</w:t>
+        <w:t xml:space="preserve">The loss dipole is not DAR.</w:t>
+      </w:r>
+      <w:r>
+        <w:t xml:space="preserve"> </w:t>
+      </w:r>
+      <w:r>
+        <w:t xml:space="preserve">It is not a geometric fiber-to-light offset (dither), not in the stellar</w:t>
+      </w:r>
+      <w:r>
+        <w:t xml:space="preserve"> </w:t>
+      </w:r>
+      <w:r>
+        <w:t xml:space="preserve">model (model-vs-data split), and it reproduces on all point sources with external photometry — so it is a</w:t>
+      </w:r>
+      <w:r>
+        <w:t xml:space="preserve"> </w:t>
+      </w:r>
+      <w:r>
+        <w:rPr>
+          <w:b/>
+          <w:bCs/>
+        </w:rPr>
+        <w:t xml:space="preserve">flux-processing effect in point-source spectrophotometry</w:t>
+      </w:r>
+      <w:r>
+        <w:t xml:space="preserve">, entering at the</w:t>
+      </w:r>
+      <w:r>
+        <w:t xml:space="preserve"> </w:t>
+      </w:r>
+      <w:r>
+        <w:rPr>
+          <w:b/>
+          <w:bCs/>
+        </w:rPr>
+        <w:t xml:space="preserve">sky-subtraction</w:t>
+      </w:r>
+      <w:r>
+        <w:t xml:space="preserve"> </w:t>
+      </w:r>
+      <w:r>
+        <w:t xml:space="preserve">step of</w:t>
+      </w:r>
+      <w:r>
+        <w:t xml:space="preserve"> </w:t>
+      </w:r>
+      <w:r>
+        <w:t xml:space="preserve">the pipeline. It mimicked DAR because the night sky it couples to is zenith-tied and airmass-growing.</w:t>
       </w:r>
     </w:p>
     <w:p>
@@ -6828,139 +7313,66 @@
       </w:pPr>
       <w:r>
         <w:rPr>
-          <w:b/>
-          <w:bCs/>
-        </w:rPr>
-        <w:t xml:space="preserve">The dither null rests on modest statistics</w:t>
-      </w:r>
-      <w:r>
-        <w:t xml:space="preserve"> </w:t>
-      </w:r>
-      <w:r>
-        <w:t xml:space="preserve">— 156 exposures but only ~12 independent nights (airmass</w:t>
-      </w:r>
-      <w:r>
-        <w:t xml:space="preserve"> </w:t>
-      </w:r>
-      <w:r>
-        <w:t xml:space="preserve">barely varies within a sequence). It is a real positive control (same data resolves the quadrupole), but</w:t>
-      </w:r>
-      <w:r>
-        <w:t xml:space="preserve"> </w:t>
-      </w:r>
-      <w:r>
-        <w:t xml:space="preserve">dither sequences are curated exposures; if they are systematically taken under different sky-brightness</w:t>
-      </w:r>
-      <w:r>
-        <w:t xml:space="preserve"> </w:t>
-      </w:r>
-      <w:r>
-        <w:t xml:space="preserve">conditions than typical science exposures, that is a confound we have not explicitly ruled out for that</w:t>
-      </w:r>
-      <w:r>
-        <w:t xml:space="preserve"> </w:t>
-      </w:r>
-      <w:r>
-        <w:t xml:space="preserve">test. The sky-subtraction localization stands independent of the dither.</w:t>
-      </w:r>
-    </w:p>
-    <w:p>
-      <w:pPr>
-        <w:pStyle w:val="Compact"/>
-        <w:numPr>
-          <w:ilvl w:val="0"/>
-          <w:numId w:val="1009"/>
-        </w:numPr>
-      </w:pPr>
-      <w:r>
-        <w:rPr>
-          <w:b/>
-          <w:bCs/>
-        </w:rPr>
-        <w:t xml:space="preserve">A real, non-bug alternative — tested and disfavored, not formaly ruled out:</w:t>
-      </w:r>
-      <w:r>
-        <w:t xml:space="preserve"> </w:t>
-      </w:r>
-      <w:r>
-        <w:t xml:space="preserve">a genuine field-scale</w:t>
-      </w:r>
-      <w:r>
-        <w:t xml:space="preserve"> </w:t>
-      </w:r>
-      <w:r>
-        <w:t xml:space="preserve">sky-brightness gradient (moonlight/airglow varying across the 3° field) that the pipeline’s mean-sky model</w:t>
-      </w:r>
-      <w:r>
-        <w:t xml:space="preserve"> </w:t>
-      </w:r>
-      <w:r>
-        <w:t xml:space="preserve">does not capture would be a real atmospheric effect entering through an idealized model. The sky-residual</w:t>
-      </w:r>
-      <w:r>
-        <w:t xml:space="preserve"> </w:t>
-      </w:r>
-      <w:r>
-        <w:t xml:space="preserve">null measured directly at sky fibers (§9) disfavors this specific version, but it is worth naming as tested</w:t>
-      </w:r>
-      <w:r>
-        <w:t xml:space="preserve"> </w:t>
-      </w:r>
-      <w:r>
-        <w:t xml:space="preserve">rather than dismissed.</w:t>
-      </w:r>
-    </w:p>
-    <w:p>
-      <w:pPr>
-        <w:pStyle w:val="Compact"/>
-        <w:numPr>
-          <w:ilvl w:val="0"/>
-          <w:numId w:val="1009"/>
-        </w:numPr>
-      </w:pPr>
-      <w:r>
-        <w:rPr>
-          <w:b/>
-          <w:bCs/>
-        </w:rPr>
-        <w:t xml:space="preserve">Differential atmospheric extinction</w:t>
-      </w:r>
-      <w:r>
-        <w:t xml:space="preserve"> </w:t>
-      </w:r>
-      <w:r>
-        <w:t xml:space="preserve">(real airmass variation across the field, independent of DAR) is a</w:t>
-      </w:r>
-      <w:r>
-        <w:t xml:space="preserve"> </w:t>
-      </w:r>
-      <w:r>
-        <w:t xml:space="preserve">legitimate physical candidate; a rough magnitude estimate is ~10× too small, and it should already be</w:t>
-      </w:r>
-      <w:r>
-        <w:t xml:space="preserve"> </w:t>
-      </w:r>
-      <w:r>
-        <w:t xml:space="preserve">present in the raw extracted counts, whereas the dipole’s amplitude mostly appears at sky subtraction.</w:t>
-      </w:r>
-    </w:p>
-    <w:bookmarkEnd w:id="58"/>
-    <w:bookmarkStart w:id="59" w:name="handoff-to-desispec"/>
+          <w:rStyle w:val="VerbatimChar"/>
+          <w:b/>
+          <w:bCs/>
+        </w:rPr>
+        <w:t xml:space="preserve">RCALIBFRAC</w:t>
+      </w:r>
+      <w:r>
+        <w:rPr>
+          <w:b/>
+          <w:bCs/>
+        </w:rPr>
+        <w:t xml:space="preserve"> </w:t>
+      </w:r>
+      <w:r>
+        <w:rPr>
+          <w:b/>
+          <w:bCs/>
+        </w:rPr>
+        <w:t xml:space="preserve">carries two construction artifacts</w:t>
+      </w:r>
+      <w:r>
+        <w:t xml:space="preserve">, discovered here: the mid-2025 flat→psf aperture</w:t>
+      </w:r>
+      <w:r>
+        <w:t xml:space="preserve"> </w:t>
+      </w:r>
+      <w:r>
+        <w:t xml:space="preserve">correction that shifted the loss</w:t>
+      </w:r>
+      <w:r>
+        <w:t xml:space="preserve"> </w:t>
+      </w:r>
+      <w:r>
+        <w:rPr>
+          <w:i/>
+          <w:iCs/>
+        </w:rPr>
+        <w:t xml:space="preserve">level</w:t>
+      </w:r>
+      <w:r>
+        <w:t xml:space="preserve"> </w:t>
+      </w:r>
+      <w:r>
+        <w:t xml:space="preserve">(Finding 1), and the sky-subtraction dipole. It is not a clean</w:t>
+      </w:r>
+      <w:r>
+        <w:t xml:space="preserve"> </w:t>
+      </w:r>
+      <w:r>
+        <w:t xml:space="preserve">flux-loss estimator for a DAR study — but the physical DAR result (the quadrupole) is unaffected.</w:t>
+      </w:r>
+    </w:p>
+    <w:bookmarkEnd w:id="57"/>
+    <w:bookmarkStart w:id="58" w:name="Xbd990e89156704c74fb84a657adeecd33f3f72e"/>
     <w:p>
       <w:pPr>
         <w:pStyle w:val="Heading2"/>
       </w:pPr>
       <w:r>
-        <w:t xml:space="preserve">Handoff to</w:t>
-      </w:r>
-      <w:r>
-        <w:t xml:space="preserve"> </w:t>
-      </w:r>
-      <w:r>
-        <w:rPr>
-          <w:rStyle w:val="VerbatimChar"/>
-        </w:rPr>
-        <w:t xml:space="preserve">desispec</w:t>
+        <w:t xml:space="preserve">Limitations — what a calibration reviewer would (rightly) push on</w:t>
       </w:r>
     </w:p>
     <w:p>
@@ -6968,110 +7380,7 @@
         <w:pStyle w:val="FirstParagraph"/>
       </w:pPr>
       <w:r>
-        <w:t xml:space="preserve">The finding with the widest reach is that a</w:t>
-      </w:r>
-      <w:r>
-        <w:t xml:space="preserve"> </w:t>
-      </w:r>
-      <w:r>
-        <w:rPr>
-          <w:b/>
-          <w:bCs/>
-        </w:rPr>
-        <w:t xml:space="preserve">zenith-tied, airmass-growing bias enters point-source</w:t>
-      </w:r>
-      <w:r>
-        <w:rPr>
-          <w:b/>
-          <w:bCs/>
-        </w:rPr>
-        <w:t xml:space="preserve"> </w:t>
-      </w:r>
-      <w:r>
-        <w:rPr>
-          <w:b/>
-          <w:bCs/>
-        </w:rPr>
-        <w:t xml:space="preserve">spectrophotometry at sky subtraction</w:t>
-      </w:r>
-      <w:r>
-        <w:t xml:space="preserve"> </w:t>
-      </w:r>
-      <w:r>
-        <w:t xml:space="preserve">— inherited by</w:t>
-      </w:r>
-      <w:r>
-        <w:t xml:space="preserve"> </w:t>
-      </w:r>
-      <w:r>
-        <w:rPr>
-          <w:rStyle w:val="VerbatimChar"/>
-        </w:rPr>
-        <w:t xml:space="preserve">RCALIBFRAC</w:t>
-      </w:r>
-      <w:r>
-        <w:t xml:space="preserve">, by a direct counts-vs-photometry metric,</w:t>
-      </w:r>
-      <w:r>
-        <w:t xml:space="preserve"> </w:t>
-      </w:r>
-      <w:r>
-        <w:t xml:space="preserve">and by anything built on sky-subtracted point-source flux. This is a</w:t>
-      </w:r>
-      <w:r>
-        <w:t xml:space="preserve"> </w:t>
-      </w:r>
-      <w:r>
-        <w:rPr>
-          <w:rStyle w:val="VerbatimChar"/>
-        </w:rPr>
-        <w:t xml:space="preserve">desispec</w:t>
-      </w:r>
-      <w:r>
-        <w:t xml:space="preserve"> </w:t>
-      </w:r>
-      <w:r>
-        <w:t xml:space="preserve">question, not one this study</w:t>
-      </w:r>
-      <w:r>
-        <w:t xml:space="preserve"> </w:t>
-      </w:r>
-      <w:r>
-        <w:t xml:space="preserve">can settle from outside, and notably the standard photometry-comparison metric is</w:t>
-      </w:r>
-      <w:r>
-        <w:t xml:space="preserve"> </w:t>
-      </w:r>
-      <w:r>
-        <w:rPr>
-          <w:b/>
-          <w:bCs/>
-        </w:rPr>
-        <w:t xml:space="preserve">not</w:t>
-      </w:r>
-      <w:r>
-        <w:t xml:space="preserve"> </w:t>
-      </w:r>
-      <w:r>
-        <w:t xml:space="preserve">an escape from it.</w:t>
-      </w:r>
-      <w:r>
-        <w:t xml:space="preserve"> </w:t>
-      </w:r>
-      <w:r>
-        <w:t xml:space="preserve">We hand it to Julien Guy, who maintains</w:t>
-      </w:r>
-      <w:r>
-        <w:t xml:space="preserve"> </w:t>
-      </w:r>
-      <w:r>
-        <w:rPr>
-          <w:rStyle w:val="VerbatimChar"/>
-        </w:rPr>
-        <w:t xml:space="preserve">desispec</w:t>
-      </w:r>
-      <w:r>
-        <w:t xml:space="preserve">, with these concrete facts as a starting point:</w:t>
+        <w:t xml:space="preserve">Stated explicitly rather than left for a reader to infer:</w:t>
       </w:r>
     </w:p>
     <w:p>
@@ -7083,29 +7392,23 @@
         </w:numPr>
       </w:pPr>
       <w:r>
-        <w:t xml:space="preserve">The effect is a real, zenith-tied, airmass-growing bias in the r-band flux (scaling</w:t>
-      </w:r>
-      <w:r>
-        <w:t xml:space="preserve"> </w:t>
-      </w:r>
-      <w:r>
-        <w:rPr>
-          <w:i/>
-          <w:iCs/>
-        </w:rPr>
-        <w:t xml:space="preserve">super-linearly</w:t>
-      </w:r>
-      <w:r>
-        <w:t xml:space="preserve"> </w:t>
-      </w:r>
-      <w:r>
-        <w:t xml:space="preserve">with</w:t>
-      </w:r>
-      <w:r>
-        <w:t xml:space="preserve"> </w:t>
-      </w:r>
-      <w:r>
-        <w:t xml:space="preserve">star brightness — neither a simple additive nor a simple multiplicative term), that enters at</w:t>
+        <w:rPr>
+          <w:b/>
+          <w:bCs/>
+        </w:rPr>
+        <w:t xml:space="preserve">The step attribution rests on an external reimplementation.</w:t>
+      </w:r>
+      <w:r>
+        <w:t xml:space="preserve"> </w:t>
+      </w:r>
+      <w:r>
+        <w:t xml:space="preserve">Our stage-by-stage decomposition (§8),</w:t>
+      </w:r>
+      <w:r>
+        <w:t xml:space="preserve"> </w:t>
+      </w:r>
+      <w:r>
+        <w:t xml:space="preserve">which pins the jump to</w:t>
       </w:r>
       <w:r>
         <w:t xml:space="preserve"> </w:t>
@@ -7120,7 +7423,103 @@
         <w:t xml:space="preserve"> </w:t>
       </w:r>
       <w:r>
-        <w:t xml:space="preserve">(present after that step, absent or much smaller before, unchanged by the aperture correction after).</w:t>
+        <w:t xml:space="preserve">specifically, uses a reimplementation of the pipeline validated</w:t>
+      </w:r>
+      <w:r>
+        <w:t xml:space="preserve"> </w:t>
+      </w:r>
+      <w:r>
+        <w:t xml:space="preserve">against production only at the final</w:t>
+      </w:r>
+      <w:r>
+        <w:t xml:space="preserve"> </w:t>
+      </w:r>
+      <w:r>
+        <w:rPr>
+          <w:rStyle w:val="VerbatimChar"/>
+        </w:rPr>
+        <w:t xml:space="preserve">RCALIBFRAC</w:t>
+      </w:r>
+      <w:r>
+        <w:t xml:space="preserve"> </w:t>
+      </w:r>
+      <w:r>
+        <w:t xml:space="preserve">value, not at each intermediate stage (desispec does</w:t>
+      </w:r>
+      <w:r>
+        <w:t xml:space="preserve"> </w:t>
+      </w:r>
+      <w:r>
+        <w:t xml:space="preserve">not save those). A subtle reimplementation bug that moved the dipole between stages without changing the</w:t>
+      </w:r>
+      <w:r>
+        <w:t xml:space="preserve"> </w:t>
+      </w:r>
+      <w:r>
+        <w:t xml:space="preserve">final answer would not be caught by our checks.</w:t>
+      </w:r>
+      <w:r>
+        <w:t xml:space="preserve"> </w:t>
+      </w:r>
+      <w:r>
+        <w:t xml:space="preserve">“It is in the sky-subtracted flux”</w:t>
+      </w:r>
+      <w:r>
+        <w:t xml:space="preserve"> </w:t>
+      </w:r>
+      <w:r>
+        <w:t xml:space="preserve">is production-validated</w:t>
+      </w:r>
+      <w:r>
+        <w:t xml:space="preserve"> </w:t>
+      </w:r>
+      <w:r>
+        <w:t xml:space="preserve">(via the point-source metric on production flux, Part V);</w:t>
+      </w:r>
+      <w:r>
+        <w:t xml:space="preserve"> </w:t>
+      </w:r>
+      <w:r>
+        <w:t xml:space="preserve">“it enters at the</w:t>
+      </w:r>
+      <w:r>
+        <w:t xml:space="preserve"> </w:t>
+      </w:r>
+      <w:r>
+        <w:rPr>
+          <w:rStyle w:val="VerbatimChar"/>
+        </w:rPr>
+        <w:t xml:space="preserve">subtract_sky</w:t>
+      </w:r>
+      <w:r>
+        <w:t xml:space="preserve"> </w:t>
+      </w:r>
+      <w:r>
+        <w:t xml:space="preserve">step”</w:t>
+      </w:r>
+      <w:r>
+        <w:t xml:space="preserve"> </w:t>
+      </w:r>
+      <w:r>
+        <w:t xml:space="preserve">rather than an</w:t>
+      </w:r>
+      <w:r>
+        <w:t xml:space="preserve"> </w:t>
+      </w:r>
+      <w:r>
+        <w:t xml:space="preserve">adjacent step (e.g. extraction) is a strong lead for the pipeline authors to verify directly, not a</w:t>
+      </w:r>
+      <w:r>
+        <w:t xml:space="preserve"> </w:t>
+      </w:r>
+      <w:r>
+        <w:t xml:space="preserve">confirmed diagnosis. A small dipole already present in the raw extracted counts (§8) is a reminder the</w:t>
+      </w:r>
+      <w:r>
+        <w:t xml:space="preserve"> </w:t>
+      </w:r>
+      <w:r>
+        <w:t xml:space="preserve">step attribution is not clean-cut even in our own staging.</w:t>
       </w:r>
     </w:p>
     <w:p>
@@ -7132,13 +7531,44 @@
         </w:numPr>
       </w:pPr>
       <w:r>
-        <w:t xml:space="preserve">It requires the star’s own flux to be present (null at pure sky fibers) and scales with both star brightness</w:t>
-      </w:r>
-      <w:r>
-        <w:t xml:space="preserve"> </w:t>
-      </w:r>
-      <w:r>
-        <w:t xml:space="preserve">and overall sky brightness.</w:t>
+        <w:rPr>
+          <w:b/>
+          <w:bCs/>
+        </w:rPr>
+        <w:t xml:space="preserve">Elimination is not identification.</w:t>
+      </w:r>
+      <w:r>
+        <w:t xml:space="preserve"> </w:t>
+      </w:r>
+      <w:r>
+        <w:t xml:space="preserve">We ruled out three specific</w:t>
+      </w:r>
+      <w:r>
+        <w:t xml:space="preserve"> </w:t>
+      </w:r>
+      <w:r>
+        <w:rPr>
+          <w:rStyle w:val="VerbatimChar"/>
+        </w:rPr>
+        <w:t xml:space="preserve">subtract_sky</w:t>
+      </w:r>
+      <w:r>
+        <w:t xml:space="preserve"> </w:t>
+      </w:r>
+      <w:r>
+        <w:t xml:space="preserve">mechanisms and the entire</w:t>
+      </w:r>
+      <w:r>
+        <w:t xml:space="preserve"> </w:t>
+      </w:r>
+      <w:r>
+        <w:t xml:space="preserve">ivar-weighting class; that narrows the search but does not prove any particular cause. The true mechanism</w:t>
+      </w:r>
+      <w:r>
+        <w:t xml:space="preserve"> </w:t>
+      </w:r>
+      <w:r>
+        <w:t xml:space="preserve">could be one we did not think to test, or in an adjacent step.</w:t>
       </w:r>
     </w:p>
     <w:p>
@@ -7150,25 +7580,41 @@
         </w:numPr>
       </w:pPr>
       <w:r>
-        <w:t xml:space="preserve">It is not produced by</w:t>
-      </w:r>
-      <w:r>
-        <w:t xml:space="preserve"> </w:t>
-      </w:r>
-      <w:r>
-        <w:rPr>
-          <w:rStyle w:val="VerbatimChar"/>
-        </w:rPr>
-        <w:t xml:space="preserve">_model_variance</w:t>
-      </w:r>
-      <w:r>
-        <w:t xml:space="preserve">’s ivar inflation, the sky-line throughput correction, or</w:t>
-      </w:r>
-      <w:r>
-        <w:t xml:space="preserve"> </w:t>
-      </w:r>
-      <w:r>
-        <w:t xml:space="preserve">ivar-weighting of the reduction in general.</w:t>
+        <w:rPr>
+          <w:b/>
+          <w:bCs/>
+        </w:rPr>
+        <w:t xml:space="preserve">The dither null rests on modest statistics</w:t>
+      </w:r>
+      <w:r>
+        <w:t xml:space="preserve"> </w:t>
+      </w:r>
+      <w:r>
+        <w:t xml:space="preserve">— 156 exposures but only ~12 independent nights (airmass</w:t>
+      </w:r>
+      <w:r>
+        <w:t xml:space="preserve"> </w:t>
+      </w:r>
+      <w:r>
+        <w:t xml:space="preserve">barely varies within a sequence). It is a real positive control (same data resolves the quadrupole), but</w:t>
+      </w:r>
+      <w:r>
+        <w:t xml:space="preserve"> </w:t>
+      </w:r>
+      <w:r>
+        <w:t xml:space="preserve">dither sequences are curated exposures; if they are systematically taken under different sky-brightness</w:t>
+      </w:r>
+      <w:r>
+        <w:t xml:space="preserve"> </w:t>
+      </w:r>
+      <w:r>
+        <w:t xml:space="preserve">conditions than typical science exposures, that is a confound we have not explicitly ruled out for that</w:t>
+      </w:r>
+      <w:r>
+        <w:t xml:space="preserve"> </w:t>
+      </w:r>
+      <w:r>
+        <w:t xml:space="preserve">test. The sky-subtraction localization stands independent of the dither.</w:t>
       </w:r>
     </w:p>
     <w:p>
@@ -7180,31 +7626,94 @@
         </w:numPr>
       </w:pPr>
       <w:r>
-        <w:t xml:space="preserve">The exact algorithmic step is the one piece left to identify, and (limitation 1) the</w:t>
-      </w:r>
-      <w:r>
-        <w:t xml:space="preserve"> </w:t>
-      </w:r>
-      <w:r>
-        <w:t xml:space="preserve">“sky subtraction”</w:t>
-      </w:r>
-      <w:r>
-        <w:t xml:space="preserve"> </w:t>
-      </w:r>
-      <w:r>
-        <w:t xml:space="preserve">vs</w:t>
-      </w:r>
-      <w:r>
-        <w:t xml:space="preserve"> </w:t>
-      </w:r>
-      <w:r>
-        <w:t xml:space="preserve">“adjacent step”</w:t>
-      </w:r>
-      <w:r>
-        <w:t xml:space="preserve"> </w:t>
-      </w:r>
-      <w:r>
-        <w:t xml:space="preserve">attribution should be verified in the real code path.</w:t>
+        <w:rPr>
+          <w:b/>
+          <w:bCs/>
+        </w:rPr>
+        <w:t xml:space="preserve">A real, non-bug alternative — tested and disfavored, not formaly ruled out:</w:t>
+      </w:r>
+      <w:r>
+        <w:t xml:space="preserve"> </w:t>
+      </w:r>
+      <w:r>
+        <w:t xml:space="preserve">a genuine field-scale</w:t>
+      </w:r>
+      <w:r>
+        <w:t xml:space="preserve"> </w:t>
+      </w:r>
+      <w:r>
+        <w:t xml:space="preserve">sky-brightness gradient (moonlight/airglow varying across the 3° field) that the pipeline’s mean-sky model</w:t>
+      </w:r>
+      <w:r>
+        <w:t xml:space="preserve"> </w:t>
+      </w:r>
+      <w:r>
+        <w:t xml:space="preserve">does not capture would be a real atmospheric effect entering through an idealized model. The sky-residual</w:t>
+      </w:r>
+      <w:r>
+        <w:t xml:space="preserve"> </w:t>
+      </w:r>
+      <w:r>
+        <w:t xml:space="preserve">null measured directly at sky fibers (§9) disfavors this specific version, but it is worth naming as tested</w:t>
+      </w:r>
+      <w:r>
+        <w:t xml:space="preserve"> </w:t>
+      </w:r>
+      <w:r>
+        <w:t xml:space="preserve">rather than dismissed.</w:t>
+      </w:r>
+    </w:p>
+    <w:p>
+      <w:pPr>
+        <w:pStyle w:val="Compact"/>
+        <w:numPr>
+          <w:ilvl w:val="0"/>
+          <w:numId w:val="1010"/>
+        </w:numPr>
+      </w:pPr>
+      <w:r>
+        <w:rPr>
+          <w:b/>
+          <w:bCs/>
+        </w:rPr>
+        <w:t xml:space="preserve">Differential atmospheric extinction</w:t>
+      </w:r>
+      <w:r>
+        <w:t xml:space="preserve"> </w:t>
+      </w:r>
+      <w:r>
+        <w:t xml:space="preserve">(real airmass variation across the field, independent of DAR) is a</w:t>
+      </w:r>
+      <w:r>
+        <w:t xml:space="preserve"> </w:t>
+      </w:r>
+      <w:r>
+        <w:t xml:space="preserve">legitimate physical candidate; a rough magnitude estimate is ~10× too small, and it should already be</w:t>
+      </w:r>
+      <w:r>
+        <w:t xml:space="preserve"> </w:t>
+      </w:r>
+      <w:r>
+        <w:t xml:space="preserve">present in the raw extracted counts, whereas the dipole’s amplitude mostly appears at sky subtraction.</w:t>
+      </w:r>
+    </w:p>
+    <w:bookmarkEnd w:id="58"/>
+    <w:bookmarkStart w:id="59" w:name="handoff-to-desispec"/>
+    <w:p>
+      <w:pPr>
+        <w:pStyle w:val="Heading2"/>
+      </w:pPr>
+      <w:r>
+        <w:t xml:space="preserve">Handoff to</w:t>
+      </w:r>
+      <w:r>
+        <w:t xml:space="preserve"> </w:t>
+      </w:r>
+      <w:r>
+        <w:rPr>
+          <w:rStyle w:val="VerbatimChar"/>
+        </w:rPr>
+        <w:t xml:space="preserve">desispec</w:t>
       </w:r>
     </w:p>
     <w:p>
@@ -7212,24 +7721,110 @@
         <w:pStyle w:val="FirstParagraph"/>
       </w:pPr>
       <w:r>
-        <w:t xml:space="preserve">What the coupling implies for DESI flux calibration more broadly is beyond the scope of this study.</w:t>
-      </w:r>
-    </w:p>
-    <w:p>
-      <w:r>
-        <w:pict>
-          <v:rect style="width:0;height:1.5pt" o:hralign="center" o:hrstd="t" o:hr="t"/>
-        </w:pict>
-      </w:r>
-    </w:p>
-    <w:bookmarkEnd w:id="59"/>
-    <w:bookmarkStart w:id="60" w:name="Xb73a5be5a20682f8c27d97ac61bd7ce9b57ac25"/>
-    <w:p>
-      <w:pPr>
-        <w:pStyle w:val="Heading2"/>
-      </w:pPr>
-      <w:r>
-        <w:t xml:space="preserve">Appendix A — Supporting analyses and confound checks</w:t>
+        <w:t xml:space="preserve">The finding with the widest reach is that a</w:t>
+      </w:r>
+      <w:r>
+        <w:t xml:space="preserve"> </w:t>
+      </w:r>
+      <w:r>
+        <w:rPr>
+          <w:b/>
+          <w:bCs/>
+        </w:rPr>
+        <w:t xml:space="preserve">zenith-tied, airmass-growing bias enters point-source</w:t>
+      </w:r>
+      <w:r>
+        <w:rPr>
+          <w:b/>
+          <w:bCs/>
+        </w:rPr>
+        <w:t xml:space="preserve"> </w:t>
+      </w:r>
+      <w:r>
+        <w:rPr>
+          <w:b/>
+          <w:bCs/>
+        </w:rPr>
+        <w:t xml:space="preserve">spectrophotometry at sky subtraction</w:t>
+      </w:r>
+      <w:r>
+        <w:t xml:space="preserve"> </w:t>
+      </w:r>
+      <w:r>
+        <w:t xml:space="preserve">— inherited by</w:t>
+      </w:r>
+      <w:r>
+        <w:t xml:space="preserve"> </w:t>
+      </w:r>
+      <w:r>
+        <w:rPr>
+          <w:rStyle w:val="VerbatimChar"/>
+        </w:rPr>
+        <w:t xml:space="preserve">RCALIBFRAC</w:t>
+      </w:r>
+      <w:r>
+        <w:t xml:space="preserve">, by a direct counts-vs-photometry metric,</w:t>
+      </w:r>
+      <w:r>
+        <w:t xml:space="preserve"> </w:t>
+      </w:r>
+      <w:r>
+        <w:t xml:space="preserve">and by anything built on sky-subtracted point-source flux. This is a</w:t>
+      </w:r>
+      <w:r>
+        <w:t xml:space="preserve"> </w:t>
+      </w:r>
+      <w:r>
+        <w:rPr>
+          <w:rStyle w:val="VerbatimChar"/>
+        </w:rPr>
+        <w:t xml:space="preserve">desispec</w:t>
+      </w:r>
+      <w:r>
+        <w:t xml:space="preserve"> </w:t>
+      </w:r>
+      <w:r>
+        <w:t xml:space="preserve">question, not one this study</w:t>
+      </w:r>
+      <w:r>
+        <w:t xml:space="preserve"> </w:t>
+      </w:r>
+      <w:r>
+        <w:t xml:space="preserve">can settle from outside, and notably the standard photometry-comparison metric is</w:t>
+      </w:r>
+      <w:r>
+        <w:t xml:space="preserve"> </w:t>
+      </w:r>
+      <w:r>
+        <w:rPr>
+          <w:b/>
+          <w:bCs/>
+        </w:rPr>
+        <w:t xml:space="preserve">not</w:t>
+      </w:r>
+      <w:r>
+        <w:t xml:space="preserve"> </w:t>
+      </w:r>
+      <w:r>
+        <w:t xml:space="preserve">an escape from it.</w:t>
+      </w:r>
+      <w:r>
+        <w:t xml:space="preserve"> </w:t>
+      </w:r>
+      <w:r>
+        <w:t xml:space="preserve">We hand it to Julien Guy, who maintains</w:t>
+      </w:r>
+      <w:r>
+        <w:t xml:space="preserve"> </w:t>
+      </w:r>
+      <w:r>
+        <w:rPr>
+          <w:rStyle w:val="VerbatimChar"/>
+        </w:rPr>
+        <w:t xml:space="preserve">desispec</w:t>
+      </w:r>
+      <w:r>
+        <w:t xml:space="preserve">, with these concrete facts as a starting point:</w:t>
       </w:r>
     </w:p>
     <w:p>
@@ -7241,92 +7836,44 @@
         </w:numPr>
       </w:pPr>
       <w:r>
-        <w:rPr>
-          <w:b/>
-          <w:bCs/>
-        </w:rPr>
-        <w:t xml:space="preserve">The radial monopole is seeing, not DAR.</w:t>
-      </w:r>
-      <w:r>
-        <w:t xml:space="preserve"> </w:t>
-      </w:r>
-      <w:r>
-        <w:t xml:space="preserve">The isotropic center-to-edge gradient flattens with airmass; a</w:t>
-      </w:r>
-      <w:r>
-        <w:t xml:space="preserve"> </w:t>
-      </w:r>
-      <w:r>
-        <w:t xml:space="preserve">zenith-direction decomposition (using</w:t>
-      </w:r>
-      <w:r>
-        <w:t xml:space="preserve"> </w:t>
-      </w:r>
-      <w:r>
-        <w:rPr>
-          <w:rStyle w:val="VerbatimChar"/>
-        </w:rPr>
-        <w:t xml:space="preserve">desimeter</w:t>
-      </w:r>
-      <w:r>
-        <w:t xml:space="preserve">’s validated transforms, checked against the DB</w:t>
-      </w:r>
-      <w:r>
-        <w:t xml:space="preserve"> </w:t>
-      </w:r>
-      <w:r>
-        <w:rPr>
-          <w:rStyle w:val="VerbatimChar"/>
-        </w:rPr>
-        <w:t xml:space="preserve">parallactic</w:t>
-      </w:r>
-      <w:r>
-        <w:t xml:space="preserve"> </w:t>
-      </w:r>
-      <w:r>
-        <w:t xml:space="preserve">column to std 0.003°) shows it is directionally near-null on population average (directional</w:t>
-      </w:r>
-      <w:r>
-        <w:t xml:space="preserve"> </w:t>
-      </w:r>
-      <w:r>
-        <w:t xml:space="preserve">R² 0.0007 vs 0.132 radial), and</w:t>
-      </w:r>
-      <w:r>
-        <w:t xml:space="preserve"> </w:t>
-      </w:r>
-      <w:r>
-        <w:rPr>
-          <w:rStyle w:val="VerbatimChar"/>
-        </w:rPr>
-        <w:t xml:space="preserve">radius × seeing</w:t>
-      </w:r>
-      <w:r>
-        <w:t xml:space="preserve"> </w:t>
-      </w:r>
-      <w:r>
-        <w:t xml:space="preserve">reproduces it slightly better than</w:t>
-      </w:r>
-      <w:r>
-        <w:t xml:space="preserve"> </w:t>
-      </w:r>
-      <w:r>
-        <w:rPr>
-          <w:rStyle w:val="VerbatimChar"/>
-        </w:rPr>
-        <w:t xml:space="preserve">radius × airmass</w:t>
-      </w:r>
-      <w:r>
-        <w:t xml:space="preserve"> </w:t>
-      </w:r>
-      <w:r>
-        <w:t xml:space="preserve">(R² 0.140 vs 0.132), each retaining an independent contribution when combined. So the monopole is seeing/PSF</w:t>
-      </w:r>
-      <w:r>
-        <w:t xml:space="preserve"> </w:t>
-      </w:r>
-      <w:r>
-        <w:t xml:space="preserve">broadening interacting with a radially-varying fiber coupling — a general atmospheric effect, not DAR.</w:t>
+        <w:t xml:space="preserve">The effect is a real, zenith-tied, airmass-growing bias in the r-band flux (scaling</w:t>
+      </w:r>
+      <w:r>
+        <w:t xml:space="preserve"> </w:t>
+      </w:r>
+      <w:r>
+        <w:rPr>
+          <w:i/>
+          <w:iCs/>
+        </w:rPr>
+        <w:t xml:space="preserve">super-linearly</w:t>
+      </w:r>
+      <w:r>
+        <w:t xml:space="preserve"> </w:t>
+      </w:r>
+      <w:r>
+        <w:t xml:space="preserve">with</w:t>
+      </w:r>
+      <w:r>
+        <w:t xml:space="preserve"> </w:t>
+      </w:r>
+      <w:r>
+        <w:t xml:space="preserve">star brightness — neither a simple additive nor a simple multiplicative term), that enters at</w:t>
+      </w:r>
+      <w:r>
+        <w:t xml:space="preserve"> </w:t>
+      </w:r>
+      <w:r>
+        <w:rPr>
+          <w:rStyle w:val="VerbatimChar"/>
+        </w:rPr>
+        <w:t xml:space="preserve">subtract_sky</w:t>
+      </w:r>
+      <w:r>
+        <w:t xml:space="preserve"> </w:t>
+      </w:r>
+      <w:r>
+        <w:t xml:space="preserve">(present after that step, absent or much smaller before, unchanged by the aperture correction after).</w:t>
       </w:r>
     </w:p>
     <w:p>
@@ -7338,50 +7885,13 @@
         </w:numPr>
       </w:pPr>
       <w:r>
-        <w:rPr>
-          <w:b/>
-          <w:bCs/>
-        </w:rPr>
-        <w:t xml:space="preserve">The within-exposure scatter channel.</w:t>
-      </w:r>
-      <w:r>
-        <w:t xml:space="preserve"> </w:t>
-      </w:r>
-      <w:r>
-        <w:t xml:space="preserve">Star-to-star scatter within an exposure grows with</w:t>
-      </w:r>
-      <w:r>
-        <w:t xml:space="preserve"> </w:t>
-      </w:r>
-      <w:r>
-        <w:rPr>
-          <w:rStyle w:val="VerbatimChar"/>
-        </w:rPr>
-        <w:t xml:space="preserve">|Δairmass|</w:t>
-      </w:r>
-      <w:r>
-        <w:t xml:space="preserve"> </w:t>
-      </w:r>
-      <w:r>
-        <w:t xml:space="preserve">(the actual airmass change during the exposure, not the snapshot): substituting it for snapshot airmass</w:t>
-      </w:r>
-      <w:r>
-        <w:t xml:space="preserve"> </w:t>
-      </w:r>
-      <w:r>
-        <w:t xml:space="preserve">nearly doubles the explanatory power (R² 0.096 → 0.144 → 0.204 on the complete population). This is the</w:t>
-      </w:r>
-      <w:r>
-        <w:t xml:space="preserve"> </w:t>
-      </w:r>
-      <w:r>
-        <w:t xml:space="preserve">magnitude-change face of the field-differential DAR drift, strongest off transit; it supports the</w:t>
-      </w:r>
-      <w:r>
-        <w:t xml:space="preserve"> </w:t>
-      </w:r>
-      <w:r>
-        <w:t xml:space="preserve">scheduling lever (Part III) and is artifact-robust to the extent it is a field-differential quantity.</w:t>
+        <w:t xml:space="preserve">It requires the star’s own flux to be present (null at pure sky fibers) and scales with both star brightness</w:t>
+      </w:r>
+      <w:r>
+        <w:t xml:space="preserve"> </w:t>
+      </w:r>
+      <w:r>
+        <w:t xml:space="preserve">and overall sky brightness.</w:t>
       </w:r>
     </w:p>
     <w:p>
@@ -7393,31 +7903,25 @@
         </w:numPr>
       </w:pPr>
       <w:r>
-        <w:rPr>
-          <w:rStyle w:val="VerbatimChar"/>
-          <w:b/>
-          <w:bCs/>
-        </w:rPr>
-        <w:t xml:space="preserve">|Δairmass|</w:t>
-      </w:r>
-      <w:r>
-        <w:rPr>
-          <w:b/>
-          <w:bCs/>
-        </w:rPr>
-        <w:t xml:space="preserve">-based scheduling table and the ADC ZD=60° wall</w:t>
-      </w:r>
-      <w:r>
-        <w:t xml:space="preserve"> </w:t>
-      </w:r>
-      <w:r>
-        <w:t xml:space="preserve">are retained from the original analysis and</w:t>
-      </w:r>
-      <w:r>
-        <w:t xml:space="preserve"> </w:t>
-      </w:r>
-      <w:r>
-        <w:t xml:space="preserve">should be re-read with the Part III scope note in mind (grounded on the quadrupole + geometry).</w:t>
+        <w:t xml:space="preserve">It is not produced by</w:t>
+      </w:r>
+      <w:r>
+        <w:t xml:space="preserve"> </w:t>
+      </w:r>
+      <w:r>
+        <w:rPr>
+          <w:rStyle w:val="VerbatimChar"/>
+        </w:rPr>
+        <w:t xml:space="preserve">_model_variance</w:t>
+      </w:r>
+      <w:r>
+        <w:t xml:space="preserve">’s ivar inflation, the sky-line throughput correction, or</w:t>
+      </w:r>
+      <w:r>
+        <w:t xml:space="preserve"> </w:t>
+      </w:r>
+      <w:r>
+        <w:t xml:space="preserve">ivar-weighting of the reduction in general.</w:t>
       </w:r>
     </w:p>
     <w:p>
@@ -7429,81 +7933,56 @@
         </w:numPr>
       </w:pPr>
       <w:r>
-        <w:rPr>
-          <w:b/>
-          <w:bCs/>
-        </w:rPr>
-        <w:t xml:space="preserve">Confounds checked:</w:t>
-      </w:r>
-      <w:r>
-        <w:t xml:space="preserve"> </w:t>
-      </w:r>
-      <w:r>
-        <w:t xml:space="preserve">region (NGC/SGC) and season (day-of-year) added to both aggregate and per-star models</w:t>
-      </w:r>
-      <w:r>
-        <w:t xml:space="preserve"> </w:t>
-      </w:r>
-      <w:r>
-        <w:t xml:space="preserve">leave the key coefficients essentially unchanged; population undercount (22%,</w:t>
-      </w:r>
-      <w:r>
-        <w:t xml:space="preserve"> </w:t>
-      </w:r>
-      <w:r>
-        <w:rPr>
-          <w:rStyle w:val="VerbatimChar"/>
-        </w:rPr>
-        <w:t xml:space="preserve">DARK1B</w:t>
-      </w:r>
-      <w:r>
-        <w:t xml:space="preserve">/</w:t>
-      </w:r>
-      <w:r>
-        <w:rPr>
-          <w:rStyle w:val="VerbatimChar"/>
-        </w:rPr>
-        <w:t xml:space="preserve">BRIGHT1B</w:t>
-      </w:r>
-      <w:r>
-        <w:t xml:space="preserve"> </w:t>
-      </w:r>
-      <w:r>
-        <w:t xml:space="preserve">initially</w:t>
-      </w:r>
-      <w:r>
-        <w:t xml:space="preserve"> </w:t>
-      </w:r>
-      <w:r>
-        <w:t xml:space="preserve">excluded by an exact-match</w:t>
-      </w:r>
-      <w:r>
-        <w:t xml:space="preserve"> </w:t>
-      </w:r>
-      <w:r>
-        <w:rPr>
-          <w:rStyle w:val="VerbatimChar"/>
-        </w:rPr>
-        <w:t xml:space="preserve">LIKE</w:t>
-      </w:r>
-      <w:r>
-        <w:t xml:space="preserve">) was corrected and every finding survived; coefficient-based extrapolation</w:t>
-      </w:r>
-      <w:r>
-        <w:t xml:space="preserve"> </w:t>
-      </w:r>
-      <w:r>
-        <w:t xml:space="preserve">into the sparse high-airmass corner was discarded twice in favor of empirical binned lookups.</w:t>
-      </w:r>
-    </w:p>
-    <w:bookmarkEnd w:id="60"/>
-    <w:bookmarkStart w:id="61" w:name="appendix-b-methods-scripts-and-data"/>
+        <w:t xml:space="preserve">The exact algorithmic step is the one piece left to identify, and (limitation 1) the</w:t>
+      </w:r>
+      <w:r>
+        <w:t xml:space="preserve"> </w:t>
+      </w:r>
+      <w:r>
+        <w:t xml:space="preserve">“sky subtraction”</w:t>
+      </w:r>
+      <w:r>
+        <w:t xml:space="preserve"> </w:t>
+      </w:r>
+      <w:r>
+        <w:t xml:space="preserve">vs</w:t>
+      </w:r>
+      <w:r>
+        <w:t xml:space="preserve"> </w:t>
+      </w:r>
+      <w:r>
+        <w:t xml:space="preserve">“adjacent step”</w:t>
+      </w:r>
+      <w:r>
+        <w:t xml:space="preserve"> </w:t>
+      </w:r>
+      <w:r>
+        <w:t xml:space="preserve">attribution should be verified in the real code path.</w:t>
+      </w:r>
+    </w:p>
+    <w:p>
+      <w:pPr>
+        <w:pStyle w:val="FirstParagraph"/>
+      </w:pPr>
+      <w:r>
+        <w:t xml:space="preserve">What the coupling implies for DESI flux calibration more broadly is beyond the scope of this study.</w:t>
+      </w:r>
+    </w:p>
+    <w:p>
+      <w:r>
+        <w:pict>
+          <v:rect style="width:0;height:1.5pt" o:hralign="center" o:hrstd="t" o:hr="t"/>
+        </w:pict>
+      </w:r>
+    </w:p>
+    <w:bookmarkEnd w:id="59"/>
+    <w:bookmarkStart w:id="60" w:name="X77fad47ccf97af3a2797bf539cafe1bdece40b6"/>
     <w:p>
       <w:pPr>
         <w:pStyle w:val="Heading2"/>
       </w:pPr>
       <w:r>
-        <w:t xml:space="preserve">Appendix B — Methods, scripts, and data</w:t>
+        <w:t xml:space="preserve">Appendix A — Supporting analyses and confound checks</w:t>
       </w:r>
     </w:p>
     <w:p>
@@ -7519,37 +7998,88 @@
           <w:b/>
           <w:bCs/>
         </w:rPr>
-        <w:t xml:space="preserve">Core measurement:</w:t>
-      </w:r>
-      <w:r>
-        <w:t xml:space="preserve"> </w:t>
-      </w:r>
-      <w:r>
-        <w:rPr>
-          <w:rStyle w:val="VerbatimChar"/>
-        </w:rPr>
-        <w:t xml:space="preserve">analysis/dar_dipole/fit_dipole_quadrupole.py</w:t>
-      </w:r>
-      <w:r>
-        <w:t xml:space="preserve"> </w:t>
-      </w:r>
-      <w:r>
-        <w:t xml:space="preserve">(D_rot/Q_rot);</w:t>
-      </w:r>
-      <w:r>
-        <w:t xml:space="preserve"> </w:t>
-      </w:r>
-      <w:r>
-        <w:rPr>
-          <w:rStyle w:val="VerbatimChar"/>
-        </w:rPr>
-        <w:t xml:space="preserve">analysis/dar_dipole/affine_fit_lib.py</w:t>
-      </w:r>
-      <w:r>
-        <w:t xml:space="preserve"> </w:t>
-      </w:r>
-      <w:r>
-        <w:t xml:space="preserve">(shared decomposition, reused across the tests).</w:t>
+        <w:t xml:space="preserve">The radial monopole is seeing, not DAR.</w:t>
+      </w:r>
+      <w:r>
+        <w:t xml:space="preserve"> </w:t>
+      </w:r>
+      <w:r>
+        <w:t xml:space="preserve">The isotropic center-to-edge gradient flattens with airmass; a</w:t>
+      </w:r>
+      <w:r>
+        <w:t xml:space="preserve"> </w:t>
+      </w:r>
+      <w:r>
+        <w:t xml:space="preserve">zenith-direction decomposition (using</w:t>
+      </w:r>
+      <w:r>
+        <w:t xml:space="preserve"> </w:t>
+      </w:r>
+      <w:r>
+        <w:rPr>
+          <w:rStyle w:val="VerbatimChar"/>
+        </w:rPr>
+        <w:t xml:space="preserve">desimeter</w:t>
+      </w:r>
+      <w:r>
+        <w:t xml:space="preserve">’s validated transforms, checked against the DB</w:t>
+      </w:r>
+      <w:r>
+        <w:t xml:space="preserve"> </w:t>
+      </w:r>
+      <w:r>
+        <w:rPr>
+          <w:rStyle w:val="VerbatimChar"/>
+        </w:rPr>
+        <w:t xml:space="preserve">parallactic</w:t>
+      </w:r>
+      <w:r>
+        <w:t xml:space="preserve"> </w:t>
+      </w:r>
+      <w:r>
+        <w:t xml:space="preserve">column to std 0.003°) shows it is directionally near-null on population average (directional</w:t>
+      </w:r>
+      <w:r>
+        <w:t xml:space="preserve"> </w:t>
+      </w:r>
+      <w:r>
+        <w:t xml:space="preserve">R² 0.0007 vs 0.132 radial), and</w:t>
+      </w:r>
+      <w:r>
+        <w:t xml:space="preserve"> </w:t>
+      </w:r>
+      <w:r>
+        <w:rPr>
+          <w:rStyle w:val="VerbatimChar"/>
+        </w:rPr>
+        <w:t xml:space="preserve">radius × seeing</w:t>
+      </w:r>
+      <w:r>
+        <w:t xml:space="preserve"> </w:t>
+      </w:r>
+      <w:r>
+        <w:t xml:space="preserve">reproduces it slightly better than</w:t>
+      </w:r>
+      <w:r>
+        <w:t xml:space="preserve"> </w:t>
+      </w:r>
+      <w:r>
+        <w:rPr>
+          <w:rStyle w:val="VerbatimChar"/>
+        </w:rPr>
+        <w:t xml:space="preserve">radius × airmass</w:t>
+      </w:r>
+      <w:r>
+        <w:t xml:space="preserve"> </w:t>
+      </w:r>
+      <w:r>
+        <w:t xml:space="preserve">(R² 0.140 vs 0.132), each retaining an independent contribution when combined. So the monopole is seeing/PSF</w:t>
+      </w:r>
+      <w:r>
+        <w:t xml:space="preserve"> </w:t>
+      </w:r>
+      <w:r>
+        <w:t xml:space="preserve">broadening interacting with a radially-varying fiber coupling — a general atmospheric effect, not DAR.</w:t>
       </w:r>
     </w:p>
     <w:p>
@@ -7565,175 +8095,46 @@
           <w:b/>
           <w:bCs/>
         </w:rPr>
-        <w:t xml:space="preserve">Part IV/V tests:</w:t>
-      </w:r>
-      <w:r>
-        <w:t xml:space="preserve"> </w:t>
-      </w:r>
-      <w:r>
-        <w:rPr>
-          <w:rStyle w:val="VerbatimChar"/>
-        </w:rPr>
-        <w:t xml:space="preserve">dither_offset_field_test.py</w:t>
-      </w:r>
-      <w:r>
-        <w:t xml:space="preserve"> </w:t>
-      </w:r>
-      <w:r>
-        <w:t xml:space="preserve">(§6, dither);</w:t>
-      </w:r>
-      <w:r>
-        <w:t xml:space="preserve"> </w:t>
-      </w:r>
-      <w:r>
-        <w:rPr>
-          <w:rStyle w:val="VerbatimChar"/>
-        </w:rPr>
-        <w:t xml:space="preserve">rebuild_rcalibfrac.py</w:t>
-      </w:r>
-      <w:r>
-        <w:t xml:space="preserve"> </w:t>
-      </w:r>
-      <w:r>
-        <w:t xml:space="preserve">(§7, model-vs-data);</w:t>
-      </w:r>
-      <w:r>
-        <w:t xml:space="preserve"> </w:t>
-      </w:r>
-      <w:r>
-        <w:rPr>
-          <w:rStyle w:val="VerbatimChar"/>
-        </w:rPr>
-        <w:t xml:space="preserve">flat_to_psf_dipole_test.py</w:t>
-      </w:r>
-      <w:r>
-        <w:t xml:space="preserve"> </w:t>
-      </w:r>
-      <w:r>
-        <w:t xml:space="preserve">(§7, aperture correction);</w:t>
-      </w:r>
-      <w:r>
-        <w:t xml:space="preserve"> </w:t>
-      </w:r>
-      <w:r>
-        <w:rPr>
-          <w:rStyle w:val="VerbatimChar"/>
-        </w:rPr>
-        <w:t xml:space="preserve">flux_chain_decomposition.py</w:t>
-      </w:r>
-      <w:r>
-        <w:t xml:space="preserve"> </w:t>
-      </w:r>
-      <w:r>
-        <w:t xml:space="preserve">(§8, stage</w:t>
-      </w:r>
-      <w:r>
-        <w:t xml:space="preserve"> </w:t>
-      </w:r>
-      <w:r>
-        <w:t xml:space="preserve">decomposition);</w:t>
-      </w:r>
-      <w:r>
-        <w:t xml:space="preserve"> </w:t>
-      </w:r>
-      <w:r>
-        <w:rPr>
-          <w:rStyle w:val="VerbatimChar"/>
-        </w:rPr>
-        <w:t xml:space="preserve">sky_residual_test.py</w:t>
-      </w:r>
-      <w:r>
-        <w:t xml:space="preserve">,</w:t>
-      </w:r>
-      <w:r>
-        <w:t xml:space="preserve"> </w:t>
-      </w:r>
-      <w:r>
-        <w:rPr>
-          <w:rStyle w:val="VerbatimChar"/>
-        </w:rPr>
-        <w:t xml:space="preserve">variance_inflation_test.py</w:t>
-      </w:r>
-      <w:r>
-        <w:t xml:space="preserve">,</w:t>
-      </w:r>
-      <w:r>
-        <w:t xml:space="preserve"> </w:t>
-      </w:r>
-      <w:r>
-        <w:rPr>
-          <w:rStyle w:val="VerbatimChar"/>
-        </w:rPr>
-        <w:t xml:space="preserve">throughput_correction_test.py</w:t>
-      </w:r>
-      <w:r>
-        <w:t xml:space="preserve">,</w:t>
-      </w:r>
-      <w:r>
-        <w:t xml:space="preserve"> </w:t>
-      </w:r>
-      <w:r>
-        <w:rPr>
-          <w:rStyle w:val="VerbatimChar"/>
-        </w:rPr>
-        <w:t xml:space="preserve">unweighted_reduction_test.py</w:t>
-      </w:r>
-      <w:r>
-        <w:t xml:space="preserve"> </w:t>
-      </w:r>
-      <w:r>
-        <w:t xml:space="preserve">(§9 discriminators and the three</w:t>
-      </w:r>
-      <w:r>
-        <w:t xml:space="preserve"> </w:t>
-      </w:r>
-      <w:r>
-        <w:rPr>
-          <w:rStyle w:val="VerbatimChar"/>
-        </w:rPr>
-        <w:t xml:space="preserve">subtract_sky</w:t>
-      </w:r>
-      <w:r>
-        <w:t xml:space="preserve"> </w:t>
-      </w:r>
-      <w:r>
-        <w:t xml:space="preserve">mechanism tests); the</w:t>
-      </w:r>
-      <w:r>
-        <w:t xml:space="preserve"> </w:t>
-      </w:r>
-      <w:r>
-        <w:t xml:space="preserve">point-source photometry metric (Part V) is the same decomposition on</w:t>
-      </w:r>
-      <w:r>
-        <w:t xml:space="preserve"> </w:t>
-      </w:r>
-      <w:r>
-        <w:rPr>
-          <w:rStyle w:val="VerbatimChar"/>
-        </w:rPr>
-        <w:t xml:space="preserve">log(counts/s) − log(FLUX_R)</w:t>
-      </w:r>
-      <w:r>
-        <w:t xml:space="preserve"> </w:t>
-      </w:r>
-      <w:r>
-        <w:t xml:space="preserve">for all</w:t>
-      </w:r>
-      <w:r>
-        <w:t xml:space="preserve"> </w:t>
-      </w:r>
-      <w:r>
-        <w:rPr>
-          <w:rStyle w:val="VerbatimChar"/>
-        </w:rPr>
-        <w:t xml:space="preserve">MORPHTYPE=='PSF'</w:t>
-      </w:r>
-      <w:r>
-        <w:t xml:space="preserve"> </w:t>
-      </w:r>
-      <w:r>
-        <w:t xml:space="preserve">fibers.</w:t>
+        <w:t xml:space="preserve">The within-exposure scatter channel.</w:t>
+      </w:r>
+      <w:r>
+        <w:t xml:space="preserve"> </w:t>
+      </w:r>
+      <w:r>
+        <w:t xml:space="preserve">Star-to-star scatter within an exposure grows with</w:t>
+      </w:r>
+      <w:r>
+        <w:t xml:space="preserve"> </w:t>
+      </w:r>
+      <w:r>
+        <w:rPr>
+          <w:rStyle w:val="VerbatimChar"/>
+        </w:rPr>
+        <w:t xml:space="preserve">|Δairmass|</w:t>
+      </w:r>
+      <w:r>
+        <w:t xml:space="preserve"> </w:t>
+      </w:r>
+      <w:r>
+        <w:t xml:space="preserve">(the actual airmass change during the exposure, not the snapshot): substituting it for snapshot airmass</w:t>
+      </w:r>
+      <w:r>
+        <w:t xml:space="preserve"> </w:t>
+      </w:r>
+      <w:r>
+        <w:t xml:space="preserve">nearly doubles the explanatory power (R² 0.096 → 0.144 → 0.204 on the complete population). This is the</w:t>
+      </w:r>
+      <w:r>
+        <w:t xml:space="preserve"> </w:t>
+      </w:r>
+      <w:r>
+        <w:t xml:space="preserve">magnitude-change face of the field-differential DAR drift, strongest off transit; it supports the</w:t>
+      </w:r>
+      <w:r>
+        <w:t xml:space="preserve"> </w:t>
+      </w:r>
+      <w:r>
+        <w:t xml:space="preserve">scheduling lever (Part III) and is artifact-robust to the extent it is a field-differential quantity.</w:t>
       </w:r>
     </w:p>
     <w:p>
@@ -7746,34 +8147,30 @@
       </w:pPr>
       <w:r>
         <w:rPr>
-          <w:b/>
-          <w:bCs/>
-        </w:rPr>
-        <w:t xml:space="preserve">Foundation check:</w:t>
-      </w:r>
-      <w:r>
-        <w:t xml:space="preserve"> </w:t>
-      </w:r>
-      <w:r>
-        <w:t xml:space="preserve">the D_rot/Q_rot result independently reproduced from a fresh database rebuild;</w:t>
-      </w:r>
-      <w:r>
-        <w:t xml:space="preserve"> </w:t>
-      </w:r>
-      <w:r>
-        <w:t xml:space="preserve">focal-plane X/Y confirmed instrument-fixed;</w:t>
-      </w:r>
-      <w:r>
-        <w:t xml:space="preserve"> </w:t>
-      </w:r>
-      <w:r>
-        <w:rPr>
-          <w:rStyle w:val="VerbatimChar"/>
-        </w:rPr>
-        <w:t xml:space="preserve">q</w:t>
-      </w:r>
-      <w:r>
-        <w:t xml:space="preserve">-permutation null.</w:t>
+          <w:rStyle w:val="VerbatimChar"/>
+          <w:b/>
+          <w:bCs/>
+        </w:rPr>
+        <w:t xml:space="preserve">|Δairmass|</w:t>
+      </w:r>
+      <w:r>
+        <w:rPr>
+          <w:b/>
+          <w:bCs/>
+        </w:rPr>
+        <w:t xml:space="preserve">-based scheduling table and the ADC ZD=60° wall</w:t>
+      </w:r>
+      <w:r>
+        <w:t xml:space="preserve"> </w:t>
+      </w:r>
+      <w:r>
+        <w:t xml:space="preserve">are retained from the original analysis and</w:t>
+      </w:r>
+      <w:r>
+        <w:t xml:space="preserve"> </w:t>
+      </w:r>
+      <w:r>
+        <w:t xml:space="preserve">should be re-read with the Part III scope note in mind (grounded on the quadrupole + geometry).</w:t>
       </w:r>
     </w:p>
     <w:p>
@@ -7789,169 +8186,77 @@
           <w:b/>
           <w:bCs/>
         </w:rPr>
-        <w:t xml:space="preserve">Geometry:</w:t>
-      </w:r>
-      <w:r>
-        <w:t xml:space="preserve"> </w:t>
-      </w:r>
-      <w:r>
-        <w:rPr>
-          <w:rStyle w:val="VerbatimChar"/>
-        </w:rPr>
-        <w:t xml:space="preserve">sec z = airmass</w:t>
-      </w:r>
-      <w:r>
-        <w:t xml:space="preserve">; parallactic angle</w:t>
-      </w:r>
-      <w:r>
-        <w:t xml:space="preserve"> </w:t>
-      </w:r>
-      <w:r>
-        <w:rPr>
-          <w:rStyle w:val="VerbatimChar"/>
-        </w:rPr>
-        <w:t xml:space="preserve">q = atan2(sinH, tanφ cosDec − sinDec cosH)</w:t>
-      </w:r>
-      <w:r>
-        <w:t xml:space="preserve">, φ = 31.9634°;</w:t>
-      </w:r>
-      <w:r>
-        <w:t xml:space="preserve"> </w:t>
-      </w:r>
-      <w:r>
-        <w:t xml:space="preserve">drift</w:t>
-      </w:r>
-      <w:r>
-        <w:t xml:space="preserve"> </w:t>
-      </w:r>
-      <w:r>
-        <w:rPr>
-          <w:rStyle w:val="VerbatimChar"/>
-        </w:rPr>
-        <w:t xml:space="preserve">= tan z · Δq</w:t>
-      </w:r>
-      <w:r>
-        <w:t xml:space="preserve">; airmass trajectory</w:t>
-      </w:r>
-      <w:r>
-        <w:t xml:space="preserve"> </w:t>
-      </w:r>
-      <w:r>
-        <w:rPr>
-          <w:rStyle w:val="VerbatimChar"/>
-        </w:rPr>
-        <w:t xml:space="preserve">HA(t) = mount_ha + sidereal_rate·t</w:t>
-      </w:r>
-      <w:r>
-        <w:t xml:space="preserve">, Dec fixed.</w:t>
-      </w:r>
-    </w:p>
-    <w:p>
-      <w:pPr>
-        <w:pStyle w:val="Compact"/>
-        <w:numPr>
-          <w:ilvl w:val="0"/>
-          <w:numId w:val="1012"/>
-        </w:numPr>
-      </w:pPr>
-      <w:r>
-        <w:rPr>
-          <w:b/>
-          <w:bCs/>
-        </w:rPr>
-        <w:t xml:space="preserve">Errors:</w:t>
-      </w:r>
-      <w:r>
-        <w:t xml:space="preserve"> </w:t>
-      </w:r>
-      <w:r>
-        <w:t xml:space="preserve">bootstrap over exposures (stars within an exposure are correlated; the dither fit clusters over</w:t>
-      </w:r>
-      <w:r>
-        <w:t xml:space="preserve"> </w:t>
-      </w:r>
-      <w:r>
-        <w:t xml:space="preserve">the 12 nights); per-star regressions use cluster-robust standard errors clustered by EXPID.</w:t>
-      </w:r>
-    </w:p>
-    <w:p>
-      <w:pPr>
-        <w:pStyle w:val="Compact"/>
-        <w:numPr>
-          <w:ilvl w:val="0"/>
-          <w:numId w:val="1012"/>
-        </w:numPr>
-      </w:pPr>
-      <w:r>
-        <w:rPr>
-          <w:b/>
-          <w:bCs/>
-        </w:rPr>
-        <w:t xml:space="preserve">Data:</w:t>
-      </w:r>
-      <w:r>
-        <w:t xml:space="preserve"> </w:t>
-      </w:r>
-      <w:r>
-        <w:t xml:space="preserve">pooled</w:t>
-      </w:r>
-      <w:r>
-        <w:t xml:space="preserve"> </w:t>
-      </w:r>
-      <w:r>
-        <w:rPr>
-          <w:rStyle w:val="VerbatimChar"/>
-        </w:rPr>
-        <w:t xml:space="preserve">calibstars</w:t>
-      </w:r>
-      <w:r>
-        <w:t xml:space="preserve"> </w:t>
-      </w:r>
-      <w:r>
-        <w:t xml:space="preserve">dataset + per-exposure pointing/timing (</w:t>
-      </w:r>
-      <w:r>
-        <w:rPr>
-          <w:rStyle w:val="VerbatimChar"/>
-        </w:rPr>
-        <w:t xml:space="preserve">data/dar_exposure_pointing.csv</w:t>
-      </w:r>
-      <w:r>
-        <w:t xml:space="preserve">, via</w:t>
-      </w:r>
-      <w:r>
-        <w:t xml:space="preserve"> </w:t>
-      </w:r>
-      <w:r>
-        <w:rPr>
-          <w:rStyle w:val="VerbatimChar"/>
-        </w:rPr>
-        <w:t xml:space="preserve">scripts/fetch_exposure_pointing.py</w:t>
-      </w:r>
-      <w:r>
-        <w:t xml:space="preserve">,</w:t>
-      </w:r>
-      <w:r>
-        <w:t xml:space="preserve"> </w:t>
-      </w:r>
-      <w:r>
-        <w:rPr>
-          <w:rStyle w:val="VerbatimChar"/>
-        </w:rPr>
-        <w:t xml:space="preserve">exposure.exposure</w:t>
-      </w:r>
-      <w:r>
-        <w:t xml:space="preserve">).</w:t>
-      </w:r>
-    </w:p>
-    <w:bookmarkEnd w:id="61"/>
-    <w:bookmarkStart w:id="62" w:name="external-references"/>
+        <w:t xml:space="preserve">Confounds checked:</w:t>
+      </w:r>
+      <w:r>
+        <w:t xml:space="preserve"> </w:t>
+      </w:r>
+      <w:r>
+        <w:t xml:space="preserve">region (NGC/SGC) and season (day-of-year) added to both aggregate and per-star models</w:t>
+      </w:r>
+      <w:r>
+        <w:t xml:space="preserve"> </w:t>
+      </w:r>
+      <w:r>
+        <w:t xml:space="preserve">leave the key coefficients essentially unchanged; population undercount (22%,</w:t>
+      </w:r>
+      <w:r>
+        <w:t xml:space="preserve"> </w:t>
+      </w:r>
+      <w:r>
+        <w:rPr>
+          <w:rStyle w:val="VerbatimChar"/>
+        </w:rPr>
+        <w:t xml:space="preserve">DARK1B</w:t>
+      </w:r>
+      <w:r>
+        <w:t xml:space="preserve">/</w:t>
+      </w:r>
+      <w:r>
+        <w:rPr>
+          <w:rStyle w:val="VerbatimChar"/>
+        </w:rPr>
+        <w:t xml:space="preserve">BRIGHT1B</w:t>
+      </w:r>
+      <w:r>
+        <w:t xml:space="preserve"> </w:t>
+      </w:r>
+      <w:r>
+        <w:t xml:space="preserve">initially</w:t>
+      </w:r>
+      <w:r>
+        <w:t xml:space="preserve"> </w:t>
+      </w:r>
+      <w:r>
+        <w:t xml:space="preserve">excluded by an exact-match</w:t>
+      </w:r>
+      <w:r>
+        <w:t xml:space="preserve"> </w:t>
+      </w:r>
+      <w:r>
+        <w:rPr>
+          <w:rStyle w:val="VerbatimChar"/>
+        </w:rPr>
+        <w:t xml:space="preserve">LIKE</w:t>
+      </w:r>
+      <w:r>
+        <w:t xml:space="preserve">) was corrected and every finding survived; coefficient-based extrapolation</w:t>
+      </w:r>
+      <w:r>
+        <w:t xml:space="preserve"> </w:t>
+      </w:r>
+      <w:r>
+        <w:t xml:space="preserve">into the sparse high-airmass corner was discarded twice in favor of empirical binned lookups.</w:t>
+      </w:r>
+    </w:p>
+    <w:bookmarkEnd w:id="60"/>
+    <w:bookmarkStart w:id="61" w:name="appendix-b--methods-scripts-and-data"/>
     <w:p>
       <w:pPr>
         <w:pStyle w:val="Heading2"/>
       </w:pPr>
       <w:r>
-        <w:t xml:space="preserve">External references</w:t>
+        <w:t xml:space="preserve">Appendix B — Methods, scripts, and data</w:t>
       </w:r>
     </w:p>
     <w:p>
@@ -7963,33 +8268,41 @@
         </w:numPr>
       </w:pPr>
       <w:r>
-        <w:t xml:space="preserve">Weiner,</w:t>
-      </w:r>
-      <w:r>
-        <w:t xml:space="preserve"> </w:t>
-      </w:r>
-      <w:r>
-        <w:rPr>
-          <w:i/>
-          <w:iCs/>
-        </w:rPr>
-        <w:t xml:space="preserve">Differential atmospheric refraction and image motion for DESI</w:t>
-      </w:r>
-      <w:r>
-        <w:t xml:space="preserve">,</w:t>
-      </w:r>
-      <w:r>
-        <w:t xml:space="preserve"> </w:t>
-      </w:r>
-      <w:r>
-        <w:rPr>
-          <w:b/>
-          <w:bCs/>
-        </w:rPr>
-        <w:t xml:space="preserve">DESI-9817</w:t>
-      </w:r>
-      <w:r>
-        <w:t xml:space="preserve">.</w:t>
+        <w:rPr>
+          <w:b/>
+          <w:bCs/>
+        </w:rPr>
+        <w:t xml:space="preserve">Core measurement:</w:t>
+      </w:r>
+      <w:r>
+        <w:t xml:space="preserve"> </w:t>
+      </w:r>
+      <w:r>
+        <w:rPr>
+          <w:rStyle w:val="VerbatimChar"/>
+        </w:rPr>
+        <w:t xml:space="preserve">analysis/dar_dipole/fit_dipole_quadrupole.py</w:t>
+      </w:r>
+      <w:r>
+        <w:t xml:space="preserve"> </w:t>
+      </w:r>
+      <w:r>
+        <w:t xml:space="preserve">(D_rot/Q_rot);</w:t>
+      </w:r>
+      <w:r>
+        <w:t xml:space="preserve"> </w:t>
+      </w:r>
+      <w:r>
+        <w:rPr>
+          <w:rStyle w:val="VerbatimChar"/>
+        </w:rPr>
+        <w:t xml:space="preserve">analysis/dar_dipole/affine_fit_lib.py</w:t>
+      </w:r>
+      <w:r>
+        <w:t xml:space="preserve"> </w:t>
+      </w:r>
+      <w:r>
+        <w:t xml:space="preserve">(shared decomposition, reused across the tests).</w:t>
       </w:r>
     </w:p>
     <w:p>
@@ -8001,17 +8314,86 @@
         </w:numPr>
       </w:pPr>
       <w:r>
-        <w:t xml:space="preserve">Kirkby,</w:t>
-      </w:r>
-      <w:r>
-        <w:t xml:space="preserve"> </w:t>
-      </w:r>
-      <w:r>
-        <w:rPr>
-          <w:i/>
-          <w:iCs/>
-        </w:rPr>
-        <w:t xml:space="preserve">Observing at High Airmass</w:t>
+        <w:rPr>
+          <w:b/>
+          <w:bCs/>
+        </w:rPr>
+        <w:t xml:space="preserve">Part IV/V tests:</w:t>
+      </w:r>
+      <w:r>
+        <w:t xml:space="preserve"> </w:t>
+      </w:r>
+      <w:r>
+        <w:rPr>
+          <w:rStyle w:val="VerbatimChar"/>
+        </w:rPr>
+        <w:t xml:space="preserve">dither_offset_field_test.py</w:t>
+      </w:r>
+      <w:r>
+        <w:t xml:space="preserve"> </w:t>
+      </w:r>
+      <w:r>
+        <w:t xml:space="preserve">(§6, dither);</w:t>
+      </w:r>
+      <w:r>
+        <w:t xml:space="preserve"> </w:t>
+      </w:r>
+      <w:r>
+        <w:rPr>
+          <w:rStyle w:val="VerbatimChar"/>
+        </w:rPr>
+        <w:t xml:space="preserve">rebuild_rcalibfrac.py</w:t>
+      </w:r>
+      <w:r>
+        <w:t xml:space="preserve"> </w:t>
+      </w:r>
+      <w:r>
+        <w:t xml:space="preserve">(§7, model-vs-data);</w:t>
+      </w:r>
+      <w:r>
+        <w:t xml:space="preserve"> </w:t>
+      </w:r>
+      <w:r>
+        <w:rPr>
+          <w:rStyle w:val="VerbatimChar"/>
+        </w:rPr>
+        <w:t xml:space="preserve">flat_to_psf_dipole_test.py</w:t>
+      </w:r>
+      <w:r>
+        <w:t xml:space="preserve"> </w:t>
+      </w:r>
+      <w:r>
+        <w:t xml:space="preserve">(§7, aperture correction);</w:t>
+      </w:r>
+      <w:r>
+        <w:t xml:space="preserve"> </w:t>
+      </w:r>
+      <w:r>
+        <w:rPr>
+          <w:rStyle w:val="VerbatimChar"/>
+        </w:rPr>
+        <w:t xml:space="preserve">flux_chain_decomposition.py</w:t>
+      </w:r>
+      <w:r>
+        <w:t xml:space="preserve"> </w:t>
+      </w:r>
+      <w:r>
+        <w:t xml:space="preserve">(§8, stage</w:t>
+      </w:r>
+      <w:r>
+        <w:t xml:space="preserve"> </w:t>
+      </w:r>
+      <w:r>
+        <w:t xml:space="preserve">decomposition);</w:t>
+      </w:r>
+      <w:r>
+        <w:t xml:space="preserve"> </w:t>
+      </w:r>
+      <w:r>
+        <w:rPr>
+          <w:rStyle w:val="VerbatimChar"/>
+        </w:rPr>
+        <w:t xml:space="preserve">sky_residual_test.py</w:t>
       </w:r>
       <w:r>
         <w:t xml:space="preserve">,</w:t>
@@ -8021,13 +8403,90 @@
       </w:r>
       <w:r>
         <w:rPr>
-          <w:b/>
-          <w:bCs/>
-        </w:rPr>
-        <w:t xml:space="preserve">DESI-8586</w:t>
-      </w:r>
-      <w:r>
-        <w:t xml:space="preserve">.</w:t>
+          <w:rStyle w:val="VerbatimChar"/>
+        </w:rPr>
+        <w:t xml:space="preserve">variance_inflation_test.py</w:t>
+      </w:r>
+      <w:r>
+        <w:t xml:space="preserve">,</w:t>
+      </w:r>
+      <w:r>
+        <w:t xml:space="preserve"> </w:t>
+      </w:r>
+      <w:r>
+        <w:rPr>
+          <w:rStyle w:val="VerbatimChar"/>
+        </w:rPr>
+        <w:t xml:space="preserve">throughput_correction_test.py</w:t>
+      </w:r>
+      <w:r>
+        <w:t xml:space="preserve">,</w:t>
+      </w:r>
+      <w:r>
+        <w:t xml:space="preserve"> </w:t>
+      </w:r>
+      <w:r>
+        <w:rPr>
+          <w:rStyle w:val="VerbatimChar"/>
+        </w:rPr>
+        <w:t xml:space="preserve">unweighted_reduction_test.py</w:t>
+      </w:r>
+      <w:r>
+        <w:t xml:space="preserve"> </w:t>
+      </w:r>
+      <w:r>
+        <w:t xml:space="preserve">(§9 discriminators and the three</w:t>
+      </w:r>
+      <w:r>
+        <w:t xml:space="preserve"> </w:t>
+      </w:r>
+      <w:r>
+        <w:rPr>
+          <w:rStyle w:val="VerbatimChar"/>
+        </w:rPr>
+        <w:t xml:space="preserve">subtract_sky</w:t>
+      </w:r>
+      <w:r>
+        <w:t xml:space="preserve"> </w:t>
+      </w:r>
+      <w:r>
+        <w:t xml:space="preserve">mechanism tests); the</w:t>
+      </w:r>
+      <w:r>
+        <w:t xml:space="preserve"> </w:t>
+      </w:r>
+      <w:r>
+        <w:t xml:space="preserve">point-source photometry metric (Part V) is the same decomposition on</w:t>
+      </w:r>
+      <w:r>
+        <w:t xml:space="preserve"> </w:t>
+      </w:r>
+      <w:r>
+        <w:rPr>
+          <w:rStyle w:val="VerbatimChar"/>
+        </w:rPr>
+        <w:t xml:space="preserve">log(counts/s) − log(FLUX_R)</w:t>
+      </w:r>
+      <w:r>
+        <w:t xml:space="preserve"> </w:t>
+      </w:r>
+      <w:r>
+        <w:t xml:space="preserve">for all</w:t>
+      </w:r>
+      <w:r>
+        <w:t xml:space="preserve"> </w:t>
+      </w:r>
+      <w:r>
+        <w:rPr>
+          <w:rStyle w:val="VerbatimChar"/>
+        </w:rPr>
+        <w:t xml:space="preserve">MORPHTYPE=='PSF'</w:t>
+      </w:r>
+      <w:r>
+        <w:t xml:space="preserve"> </w:t>
+      </w:r>
+      <w:r>
+        <w:t xml:space="preserve">fibers.</w:t>
       </w:r>
     </w:p>
     <w:p>
@@ -8039,59 +8498,35 @@
         </w:numPr>
       </w:pPr>
       <w:r>
-        <w:t xml:space="preserve">Lampton,</w:t>
-      </w:r>
-      <w:r>
-        <w:t xml:space="preserve"> </w:t>
-      </w:r>
-      <w:r>
-        <w:rPr>
-          <w:i/>
-          <w:iCs/>
-        </w:rPr>
-        <w:t xml:space="preserve">Atmospheric refraction and dispersion</w:t>
-      </w:r>
-      <w:r>
-        <w:t xml:space="preserve">,</w:t>
-      </w:r>
-      <w:r>
-        <w:t xml:space="preserve"> </w:t>
-      </w:r>
-      <w:r>
-        <w:rPr>
-          <w:b/>
-          <w:bCs/>
-        </w:rPr>
-        <w:t xml:space="preserve">DESI-0309</w:t>
-      </w:r>
-      <w:r>
-        <w:t xml:space="preserve">; Joyce,</w:t>
-      </w:r>
-      <w:r>
-        <w:t xml:space="preserve"> </w:t>
-      </w:r>
-      <w:r>
-        <w:rPr>
-          <w:i/>
-          <w:iCs/>
-        </w:rPr>
-        <w:t xml:space="preserve">DESI ADC performance</w:t>
-      </w:r>
-      <w:r>
-        <w:t xml:space="preserve">,</w:t>
-      </w:r>
-      <w:r>
-        <w:t xml:space="preserve"> </w:t>
-      </w:r>
-      <w:r>
-        <w:rPr>
-          <w:b/>
-          <w:bCs/>
-        </w:rPr>
-        <w:t xml:space="preserve">DESI-9097</w:t>
-      </w:r>
-      <w:r>
-        <w:t xml:space="preserve">.</w:t>
+        <w:rPr>
+          <w:b/>
+          <w:bCs/>
+        </w:rPr>
+        <w:t xml:space="preserve">Foundation check:</w:t>
+      </w:r>
+      <w:r>
+        <w:t xml:space="preserve"> </w:t>
+      </w:r>
+      <w:r>
+        <w:t xml:space="preserve">the D_rot/Q_rot result independently reproduced from a fresh database rebuild;</w:t>
+      </w:r>
+      <w:r>
+        <w:t xml:space="preserve"> </w:t>
+      </w:r>
+      <w:r>
+        <w:t xml:space="preserve">focal-plane X/Y confirmed instrument-fixed;</w:t>
+      </w:r>
+      <w:r>
+        <w:t xml:space="preserve"> </w:t>
+      </w:r>
+      <w:r>
+        <w:rPr>
+          <w:rStyle w:val="VerbatimChar"/>
+        </w:rPr>
+        <w:t xml:space="preserve">q</w:t>
+      </w:r>
+      <w:r>
+        <w:t xml:space="preserve">-permutation null.</w:t>
       </w:r>
     </w:p>
     <w:p>
@@ -8100,6 +8535,324 @@
         <w:numPr>
           <w:ilvl w:val="0"/>
           <w:numId w:val="1013"/>
+        </w:numPr>
+      </w:pPr>
+      <w:r>
+        <w:rPr>
+          <w:b/>
+          <w:bCs/>
+        </w:rPr>
+        <w:t xml:space="preserve">Geometry:</w:t>
+      </w:r>
+      <w:r>
+        <w:t xml:space="preserve"> </w:t>
+      </w:r>
+      <w:r>
+        <w:rPr>
+          <w:rStyle w:val="VerbatimChar"/>
+        </w:rPr>
+        <w:t xml:space="preserve">sec z = airmass</w:t>
+      </w:r>
+      <w:r>
+        <w:t xml:space="preserve">; parallactic angle</w:t>
+      </w:r>
+      <w:r>
+        <w:t xml:space="preserve"> </w:t>
+      </w:r>
+      <w:r>
+        <w:rPr>
+          <w:rStyle w:val="VerbatimChar"/>
+        </w:rPr>
+        <w:t xml:space="preserve">q = atan2(sinH, tanφ cosDec − sinDec cosH)</w:t>
+      </w:r>
+      <w:r>
+        <w:t xml:space="preserve">, φ = 31.9634°;</w:t>
+      </w:r>
+      <w:r>
+        <w:t xml:space="preserve"> </w:t>
+      </w:r>
+      <w:r>
+        <w:t xml:space="preserve">drift</w:t>
+      </w:r>
+      <w:r>
+        <w:t xml:space="preserve"> </w:t>
+      </w:r>
+      <w:r>
+        <w:rPr>
+          <w:rStyle w:val="VerbatimChar"/>
+        </w:rPr>
+        <w:t xml:space="preserve">= tan z · Δq</w:t>
+      </w:r>
+      <w:r>
+        <w:t xml:space="preserve">; airmass trajectory</w:t>
+      </w:r>
+      <w:r>
+        <w:t xml:space="preserve"> </w:t>
+      </w:r>
+      <w:r>
+        <w:rPr>
+          <w:rStyle w:val="VerbatimChar"/>
+        </w:rPr>
+        <w:t xml:space="preserve">HA(t) = mount_ha + sidereal_rate·t</w:t>
+      </w:r>
+      <w:r>
+        <w:t xml:space="preserve">, Dec fixed.</w:t>
+      </w:r>
+    </w:p>
+    <w:p>
+      <w:pPr>
+        <w:pStyle w:val="Compact"/>
+        <w:numPr>
+          <w:ilvl w:val="0"/>
+          <w:numId w:val="1013"/>
+        </w:numPr>
+      </w:pPr>
+      <w:r>
+        <w:rPr>
+          <w:b/>
+          <w:bCs/>
+        </w:rPr>
+        <w:t xml:space="preserve">Errors:</w:t>
+      </w:r>
+      <w:r>
+        <w:t xml:space="preserve"> </w:t>
+      </w:r>
+      <w:r>
+        <w:t xml:space="preserve">bootstrap over exposures (stars within an exposure are correlated; the dither fit clusters over</w:t>
+      </w:r>
+      <w:r>
+        <w:t xml:space="preserve"> </w:t>
+      </w:r>
+      <w:r>
+        <w:t xml:space="preserve">the 12 nights); per-star regressions use cluster-robust standard errors clustered by EXPID.</w:t>
+      </w:r>
+    </w:p>
+    <w:p>
+      <w:pPr>
+        <w:pStyle w:val="Compact"/>
+        <w:numPr>
+          <w:ilvl w:val="0"/>
+          <w:numId w:val="1013"/>
+        </w:numPr>
+      </w:pPr>
+      <w:r>
+        <w:rPr>
+          <w:b/>
+          <w:bCs/>
+        </w:rPr>
+        <w:t xml:space="preserve">Data:</w:t>
+      </w:r>
+      <w:r>
+        <w:t xml:space="preserve"> </w:t>
+      </w:r>
+      <w:r>
+        <w:t xml:space="preserve">pooled</w:t>
+      </w:r>
+      <w:r>
+        <w:t xml:space="preserve"> </w:t>
+      </w:r>
+      <w:r>
+        <w:rPr>
+          <w:rStyle w:val="VerbatimChar"/>
+        </w:rPr>
+        <w:t xml:space="preserve">calibstars</w:t>
+      </w:r>
+      <w:r>
+        <w:t xml:space="preserve"> </w:t>
+      </w:r>
+      <w:r>
+        <w:t xml:space="preserve">dataset + per-exposure pointing/timing (</w:t>
+      </w:r>
+      <w:r>
+        <w:rPr>
+          <w:rStyle w:val="VerbatimChar"/>
+        </w:rPr>
+        <w:t xml:space="preserve">data/dar_exposure_pointing.csv</w:t>
+      </w:r>
+      <w:r>
+        <w:t xml:space="preserve">, via</w:t>
+      </w:r>
+      <w:r>
+        <w:t xml:space="preserve"> </w:t>
+      </w:r>
+      <w:r>
+        <w:rPr>
+          <w:rStyle w:val="VerbatimChar"/>
+        </w:rPr>
+        <w:t xml:space="preserve">scripts/fetch_exposure_pointing.py</w:t>
+      </w:r>
+      <w:r>
+        <w:t xml:space="preserve">,</w:t>
+      </w:r>
+      <w:r>
+        <w:t xml:space="preserve"> </w:t>
+      </w:r>
+      <w:r>
+        <w:rPr>
+          <w:rStyle w:val="VerbatimChar"/>
+        </w:rPr>
+        <w:t xml:space="preserve">exposure.exposure</w:t>
+      </w:r>
+      <w:r>
+        <w:t xml:space="preserve">).</w:t>
+      </w:r>
+    </w:p>
+    <w:bookmarkEnd w:id="61"/>
+    <w:bookmarkStart w:id="62" w:name="external-references"/>
+    <w:p>
+      <w:pPr>
+        <w:pStyle w:val="Heading2"/>
+      </w:pPr>
+      <w:r>
+        <w:t xml:space="preserve">External references</w:t>
+      </w:r>
+    </w:p>
+    <w:p>
+      <w:pPr>
+        <w:pStyle w:val="Compact"/>
+        <w:numPr>
+          <w:ilvl w:val="0"/>
+          <w:numId w:val="1014"/>
+        </w:numPr>
+      </w:pPr>
+      <w:r>
+        <w:t xml:space="preserve">Weiner,</w:t>
+      </w:r>
+      <w:r>
+        <w:t xml:space="preserve"> </w:t>
+      </w:r>
+      <w:r>
+        <w:rPr>
+          <w:i/>
+          <w:iCs/>
+        </w:rPr>
+        <w:t xml:space="preserve">Differential atmospheric refraction and image motion for DESI</w:t>
+      </w:r>
+      <w:r>
+        <w:t xml:space="preserve">,</w:t>
+      </w:r>
+      <w:r>
+        <w:t xml:space="preserve"> </w:t>
+      </w:r>
+      <w:r>
+        <w:rPr>
+          <w:b/>
+          <w:bCs/>
+        </w:rPr>
+        <w:t xml:space="preserve">DESI-9817</w:t>
+      </w:r>
+      <w:r>
+        <w:t xml:space="preserve">.</w:t>
+      </w:r>
+    </w:p>
+    <w:p>
+      <w:pPr>
+        <w:pStyle w:val="Compact"/>
+        <w:numPr>
+          <w:ilvl w:val="0"/>
+          <w:numId w:val="1014"/>
+        </w:numPr>
+      </w:pPr>
+      <w:r>
+        <w:t xml:space="preserve">Kirkby,</w:t>
+      </w:r>
+      <w:r>
+        <w:t xml:space="preserve"> </w:t>
+      </w:r>
+      <w:r>
+        <w:rPr>
+          <w:i/>
+          <w:iCs/>
+        </w:rPr>
+        <w:t xml:space="preserve">Observing at High Airmass</w:t>
+      </w:r>
+      <w:r>
+        <w:t xml:space="preserve">,</w:t>
+      </w:r>
+      <w:r>
+        <w:t xml:space="preserve"> </w:t>
+      </w:r>
+      <w:r>
+        <w:rPr>
+          <w:b/>
+          <w:bCs/>
+        </w:rPr>
+        <w:t xml:space="preserve">DESI-8586</w:t>
+      </w:r>
+      <w:r>
+        <w:t xml:space="preserve">.</w:t>
+      </w:r>
+    </w:p>
+    <w:p>
+      <w:pPr>
+        <w:pStyle w:val="Compact"/>
+        <w:numPr>
+          <w:ilvl w:val="0"/>
+          <w:numId w:val="1014"/>
+        </w:numPr>
+      </w:pPr>
+      <w:r>
+        <w:t xml:space="preserve">Lampton,</w:t>
+      </w:r>
+      <w:r>
+        <w:t xml:space="preserve"> </w:t>
+      </w:r>
+      <w:r>
+        <w:rPr>
+          <w:i/>
+          <w:iCs/>
+        </w:rPr>
+        <w:t xml:space="preserve">Atmospheric refraction and dispersion</w:t>
+      </w:r>
+      <w:r>
+        <w:t xml:space="preserve">,</w:t>
+      </w:r>
+      <w:r>
+        <w:t xml:space="preserve"> </w:t>
+      </w:r>
+      <w:r>
+        <w:rPr>
+          <w:b/>
+          <w:bCs/>
+        </w:rPr>
+        <w:t xml:space="preserve">DESI-0309</w:t>
+      </w:r>
+      <w:r>
+        <w:t xml:space="preserve">; Joyce,</w:t>
+      </w:r>
+      <w:r>
+        <w:t xml:space="preserve"> </w:t>
+      </w:r>
+      <w:r>
+        <w:rPr>
+          <w:i/>
+          <w:iCs/>
+        </w:rPr>
+        <w:t xml:space="preserve">DESI ADC performance</w:t>
+      </w:r>
+      <w:r>
+        <w:t xml:space="preserve">,</w:t>
+      </w:r>
+      <w:r>
+        <w:t xml:space="preserve"> </w:t>
+      </w:r>
+      <w:r>
+        <w:rPr>
+          <w:b/>
+          <w:bCs/>
+        </w:rPr>
+        <w:t xml:space="preserve">DESI-9097</w:t>
+      </w:r>
+      <w:r>
+        <w:t xml:space="preserve">.</w:t>
+      </w:r>
+    </w:p>
+    <w:p>
+      <w:pPr>
+        <w:pStyle w:val="Compact"/>
+        <w:numPr>
+          <w:ilvl w:val="0"/>
+          <w:numId w:val="1014"/>
         </w:numPr>
       </w:pPr>
       <w:r>
@@ -8453,6 +9206,9 @@
     <w:abstractNumId w:val="991"/>
   </w:num>
   <w:num w:numId="1009">
+    <w:abstractNumId w:val="991"/>
+  </w:num>
+  <w:num w:numId="1010">
     <w:abstractNumId w:val="99411"/>
     <w:lvlOverride w:ilvl="0">
       <w:startOverride w:val="1"/>
@@ -8482,9 +9238,6 @@
       <w:startOverride w:val="1"/>
     </w:lvlOverride>
   </w:num>
-  <w:num w:numId="1010">
-    <w:abstractNumId w:val="991"/>
-  </w:num>
   <w:num w:numId="1011">
     <w:abstractNumId w:val="991"/>
   </w:num>
@@ -8492,6 +9245,9 @@
     <w:abstractNumId w:val="991"/>
   </w:num>
   <w:num w:numId="1013">
+    <w:abstractNumId w:val="991"/>
+  </w:num>
+  <w:num w:numId="1014">
     <w:abstractNumId w:val="991"/>
   </w:num>
 </w:numbering>

</xml_diff>